<commit_message>
se actualiza documentacion y manuales
</commit_message>
<xml_diff>
--- a/docs/manual-alumno/Manual-del-alumno.docx
+++ b/docs/manual-alumno/Manual-del-alumno.docx
@@ -2634,7 +2634,7 @@
           <w:color w:val="1E1B2E"/>
           <w:sz w:val="24"/>
         </w:rPr>
-        <w:t>Manuales abre dos documentos: Manual del lenguaje y Manual del alumno. Ver carga el documento en una ventana de la aplicación. Descargar PDF guarda el archivo en el equipo. Si el archivo no está, la ventana dice que no se pudo abrir el manual.</w:t>
+        <w:t>Manuales abre dos documentos: Manual del lenguaje y Manual del alumno. Ver abre el PDF en una ventana de la aplicación. Descargar PDF lo guarda. En el navegador usa la descarga del navegador. En la aplicación de escritorio abre el diálogo de guardar del sistema; si se cancela, no queda archivo. Si no se puede escribir, el aviso dice que no se pudo guardar el archivo.</w:t>
       </w:r>
     </w:p>
     <w:p>
@@ -2649,7 +2649,7 @@
           <w:color w:val="1E1B2E"/>
           <w:sz w:val="24"/>
         </w:rPr>
-        <w:t>Ejemplo. Ana pulsa Manuales y luego Ver en Manual del lenguaje. La ventana muestra las instrucciones y los operadores. Descargar PDF guarda Manual-del-lenguaje.pdf. El manual del docente no aparece en una cuenta de alumno.</w:t>
+        <w:t>Ejemplo. Ana pulsa Manuales y luego Ver en Manual del lenguaje. La ventana se titula Manual del lenguaje y muestra el PDF. Descargar PDF guarda Manual-del-lenguaje.pdf. El manual del docente no aparece en una cuenta de alumno.</w:t>
       </w:r>
     </w:p>
     <w:p>
@@ -2705,6 +2705,261 @@
           <w:sz w:val="20"/>
         </w:rPr>
         <w:t>Figura 19. Manuales de una cuenta de alumno: lenguaje y alumno, cada uno con Ver y Descargar PDF.</w:t>
+      </w:r>
+    </w:p>
+    <w:p>
+      <w:pPr>
+        <w:pStyle w:val="Heading1"/>
+      </w:pPr>
+      <w:r>
+        <w:rPr>
+          <w:rFonts w:ascii="Calibri" w:hAnsi="Calibri" w:cs="Calibri"/>
+          <w:b/>
+          <w:i w:val="0"/>
+          <w:color w:val="3D2A5C"/>
+          <w:sz w:val="44"/>
+        </w:rPr>
+        <w:t>23. Una sola sesión</w:t>
+      </w:r>
+    </w:p>
+    <w:p>
+      <w:pPr>
+        <w:spacing w:after="160"/>
+      </w:pPr>
+      <w:r>
+        <w:rPr>
+          <w:rFonts w:ascii="Calibri" w:hAnsi="Calibri" w:cs="Calibri"/>
+          <w:b w:val="0"/>
+          <w:i w:val="0"/>
+          <w:color w:val="1E1B2E"/>
+          <w:sz w:val="24"/>
+        </w:rPr>
+        <w:t>La cuenta solo puede estar abierta en un equipo. Entrar en otro, o en la aplicación mientras el navegador sigue dentro, no abre una segunda sesión. Salir en el primero la libera. Si nadie la cierra, a los 30 minutos sin uso también queda libre y la pantalla que estaba abierta pide volver a entrar: la sesión se cerró por inactividad.</w:t>
+      </w:r>
+    </w:p>
+    <w:p>
+      <w:pPr>
+        <w:spacing w:after="160"/>
+      </w:pPr>
+      <w:r>
+        <w:rPr>
+          <w:rFonts w:ascii="Calibri" w:hAnsi="Calibri" w:cs="Calibri"/>
+          <w:b w:val="0"/>
+          <w:i w:val="0"/>
+          <w:color w:val="1E1B2E"/>
+          <w:sz w:val="24"/>
+        </w:rPr>
+        <w:t>Tres veces seguidas con el correo o la contraseña que no coinciden bloquean ese correo durante 15 minutos. Las dos primeras avisan que el correo o la contraseña son incorrectos. La tercera dice que hay que esperar. El bloqueo es del correo, aunque la contraseña buena se escriba después.</w:t>
+      </w:r>
+    </w:p>
+    <w:p>
+      <w:pPr>
+        <w:spacing w:after="160"/>
+      </w:pPr>
+      <w:r>
+        <w:rPr>
+          <w:rFonts w:ascii="Calibri" w:hAnsi="Calibri" w:cs="Calibri"/>
+          <w:b w:val="0"/>
+          <w:i w:val="0"/>
+          <w:color w:val="1E1B2E"/>
+          <w:sz w:val="24"/>
+        </w:rPr>
+        <w:t>Ejemplo. Alguien escribe tres veces una contraseña que no es la de la cuenta. La pantalla queda así:</w:t>
+      </w:r>
+    </w:p>
+    <w:p>
+      <w:pPr>
+        <w:jc w:val="center"/>
+      </w:pPr>
+      <w:r>
+        <w:drawing>
+          <wp:inline xmlns:a="http://schemas.openxmlformats.org/drawingml/2006/main" xmlns:pic="http://schemas.openxmlformats.org/drawingml/2006/picture">
+            <wp:extent cx="5852160" cy="3657600"/>
+            <wp:docPr id="20" name="Picture 20"/>
+            <wp:cNvGraphicFramePr>
+              <a:graphicFrameLocks noChangeAspect="1"/>
+            </wp:cNvGraphicFramePr>
+            <a:graphic>
+              <a:graphicData uri="http://schemas.openxmlformats.org/drawingml/2006/picture">
+                <pic:pic>
+                  <pic:nvPicPr>
+                    <pic:cNvPr id="0" name="20-bloqueo.png"/>
+                    <pic:cNvPicPr/>
+                  </pic:nvPicPr>
+                  <pic:blipFill>
+                    <a:blip r:embed="rId28"/>
+                    <a:stretch>
+                      <a:fillRect/>
+                    </a:stretch>
+                  </pic:blipFill>
+                  <pic:spPr>
+                    <a:xfrm>
+                      <a:off x="0" y="0"/>
+                      <a:ext cx="5852160" cy="3657600"/>
+                    </a:xfrm>
+                    <a:prstGeom prst="rect"/>
+                  </pic:spPr>
+                </pic:pic>
+              </a:graphicData>
+            </a:graphic>
+          </wp:inline>
+        </w:drawing>
+      </w:r>
+    </w:p>
+    <w:p>
+      <w:pPr>
+        <w:spacing w:after="240"/>
+        <w:jc w:val="center"/>
+      </w:pPr>
+      <w:r>
+        <w:rPr>
+          <w:rFonts w:ascii="Calibri" w:hAnsi="Calibri" w:cs="Calibri"/>
+          <w:b w:val="0"/>
+          <w:i/>
+          <w:color w:val="475569"/>
+          <w:sz w:val="20"/>
+        </w:rPr>
+        <w:t>Figura 20. Al tercer intento fallido, el correo queda bloqueado 15 minutos.</w:t>
+      </w:r>
+    </w:p>
+    <w:p>
+      <w:pPr>
+        <w:spacing w:after="160"/>
+      </w:pPr>
+      <w:r>
+        <w:rPr>
+          <w:rFonts w:ascii="Calibri" w:hAnsi="Calibri" w:cs="Calibri"/>
+          <w:b w:val="0"/>
+          <w:i w:val="0"/>
+          <w:color w:val="1E1B2E"/>
+          <w:sz w:val="24"/>
+        </w:rPr>
+        <w:t>Ejemplo. La cuenta ya entró en un equipo. En otro, con el correo y la contraseña correctos, Traza no abre el editor. Hay que salir en el primero o esperar 30 minutos sin usarla.</w:t>
+      </w:r>
+    </w:p>
+    <w:p>
+      <w:pPr>
+        <w:jc w:val="center"/>
+      </w:pPr>
+      <w:r>
+        <w:drawing>
+          <wp:inline xmlns:a="http://schemas.openxmlformats.org/drawingml/2006/main" xmlns:pic="http://schemas.openxmlformats.org/drawingml/2006/picture">
+            <wp:extent cx="5852160" cy="3657600"/>
+            <wp:docPr id="21" name="Picture 21"/>
+            <wp:cNvGraphicFramePr>
+              <a:graphicFrameLocks noChangeAspect="1"/>
+            </wp:cNvGraphicFramePr>
+            <a:graphic>
+              <a:graphicData uri="http://schemas.openxmlformats.org/drawingml/2006/picture">
+                <pic:pic>
+                  <pic:nvPicPr>
+                    <pic:cNvPr id="0" name="21-sesion.png"/>
+                    <pic:cNvPicPr/>
+                  </pic:nvPicPr>
+                  <pic:blipFill>
+                    <a:blip r:embed="rId29"/>
+                    <a:stretch>
+                      <a:fillRect/>
+                    </a:stretch>
+                  </pic:blipFill>
+                  <pic:spPr>
+                    <a:xfrm>
+                      <a:off x="0" y="0"/>
+                      <a:ext cx="5852160" cy="3657600"/>
+                    </a:xfrm>
+                    <a:prstGeom prst="rect"/>
+                  </pic:spPr>
+                </pic:pic>
+              </a:graphicData>
+            </a:graphic>
+          </wp:inline>
+        </w:drawing>
+      </w:r>
+    </w:p>
+    <w:p>
+      <w:pPr>
+        <w:spacing w:after="240"/>
+        <w:jc w:val="center"/>
+      </w:pPr>
+      <w:r>
+        <w:rPr>
+          <w:rFonts w:ascii="Calibri" w:hAnsi="Calibri" w:cs="Calibri"/>
+          <w:b w:val="0"/>
+          <w:i/>
+          <w:color w:val="475569"/>
+          <w:sz w:val="20"/>
+        </w:rPr>
+        <w:t>Figura 21. La segunda entrada avisa que ya hay una sesión abierta.</w:t>
+      </w:r>
+    </w:p>
+    <w:p>
+      <w:pPr>
+        <w:spacing w:after="160"/>
+      </w:pPr>
+      <w:r>
+        <w:rPr>
+          <w:rFonts w:ascii="Calibri" w:hAnsi="Calibri" w:cs="Calibri"/>
+          <w:b w:val="0"/>
+          <w:i w:val="0"/>
+          <w:color w:val="1E1B2E"/>
+          <w:sz w:val="24"/>
+        </w:rPr>
+        <w:t>Ver, en Manuales, abre el PDF dentro de la ventana. Cerrar o Escape vuelve al editor. Descargar PDF guarda ese mismo archivo.</w:t>
+      </w:r>
+    </w:p>
+    <w:p>
+      <w:pPr>
+        <w:jc w:val="center"/>
+      </w:pPr>
+      <w:r>
+        <w:drawing>
+          <wp:inline xmlns:a="http://schemas.openxmlformats.org/drawingml/2006/main" xmlns:pic="http://schemas.openxmlformats.org/drawingml/2006/picture">
+            <wp:extent cx="5852160" cy="3657600"/>
+            <wp:docPr id="22" name="Picture 22"/>
+            <wp:cNvGraphicFramePr>
+              <a:graphicFrameLocks noChangeAspect="1"/>
+            </wp:cNvGraphicFramePr>
+            <a:graphic>
+              <a:graphicData uri="http://schemas.openxmlformats.org/drawingml/2006/picture">
+                <pic:pic>
+                  <pic:nvPicPr>
+                    <pic:cNvPr id="0" name="22-ver-pdf.png"/>
+                    <pic:cNvPicPr/>
+                  </pic:nvPicPr>
+                  <pic:blipFill>
+                    <a:blip r:embed="rId30"/>
+                    <a:stretch>
+                      <a:fillRect/>
+                    </a:stretch>
+                  </pic:blipFill>
+                  <pic:spPr>
+                    <a:xfrm>
+                      <a:off x="0" y="0"/>
+                      <a:ext cx="5852160" cy="3657600"/>
+                    </a:xfrm>
+                    <a:prstGeom prst="rect"/>
+                  </pic:spPr>
+                </pic:pic>
+              </a:graphicData>
+            </a:graphic>
+          </wp:inline>
+        </w:drawing>
+      </w:r>
+    </w:p>
+    <w:p>
+      <w:pPr>
+        <w:spacing w:after="240"/>
+        <w:jc w:val="center"/>
+      </w:pPr>
+      <w:r>
+        <w:rPr>
+          <w:rFonts w:ascii="Calibri" w:hAnsi="Calibri" w:cs="Calibri"/>
+          <w:b w:val="0"/>
+          <w:i/>
+          <w:color w:val="475569"/>
+          <w:sz w:val="20"/>
+        </w:rPr>
+        <w:t>Figura 22. Ver abre el PDF del manual del lenguaje, con Descargar PDF y Cerrar.</w:t>
       </w:r>
     </w:p>
     <w:sectPr>

</xml_diff>

<commit_message>
se actualiza documentacion con l nuevo diseño y nombre
</commit_message>
<xml_diff>
--- a/docs/manual-alumno/Manual-del-alumno.docx
+++ b/docs/manual-alumno/Manual-del-alumno.docx
@@ -12,7 +12,7 @@
           <w:b/>
           <w:i w:val="0"/>
           <w:color w:val="3D2A5C"/>
-          <w:sz w:val="64"/>
+          <w:sz w:val="44"/>
         </w:rPr>
         <w:t>Aulivana-FCDdesign</w:t>
       </w:r>
@@ -24,10 +24,10 @@
       <w:r>
         <w:rPr>
           <w:rFonts w:ascii="Calibri" w:hAnsi="Calibri" w:cs="Calibri"/>
-          <w:b w:val="0"/>
+          <w:b/>
           <w:i w:val="0"/>
           <w:color w:val="3D2A5C"/>
-          <w:sz w:val="36"/>
+          <w:sz w:val="44"/>
         </w:rPr>
         <w:t>Manual del alumno</w:t>
       </w:r>
@@ -41,10 +41,10 @@
           <w:rFonts w:ascii="Calibri" w:hAnsi="Calibri" w:cs="Calibri"/>
           <w:b w:val="0"/>
           <w:i w:val="0"/>
-          <w:color w:val="475569"/>
+          <w:color w:val="1E293B"/>
           <w:sz w:val="24"/>
         </w:rPr>
-        <w:t>Qué puedes hacer en cada menú de la aplicación, con la pantalla y un ejemplo.</w:t>
+        <w:t>Qué puedes hacer en cada menú, con la pantalla y un ejemplo.</w:t>
       </w:r>
     </w:p>
     <w:p>
@@ -56,21 +56,23 @@
           <w:rFonts w:ascii="Calibri" w:hAnsi="Calibri" w:cs="Calibri"/>
           <w:b w:val="0"/>
           <w:i w:val="0"/>
-          <w:color w:val="475569"/>
-          <w:sz w:val="22"/>
+          <w:color w:val="1E293B"/>
+          <w:sz w:val="24"/>
         </w:rPr>
-        <w:t>19 de octubre de 2026</w:t>
+        <w:t>21 de octubre de 2026</w:t>
       </w:r>
     </w:p>
     <w:p>
+      <w:pPr/>
       <w:r>
         <w:rPr>
           <w:rFonts w:ascii="Calibri" w:hAnsi="Calibri" w:cs="Calibri"/>
           <w:b w:val="0"/>
           <w:i w:val="0"/>
+          <w:color w:val="1E293B"/>
           <w:sz w:val="24"/>
         </w:rPr>
-        <w:t>Este manual es para quien entra como estudiante. Los menús de docente y de administrador no están aquí. El nivel de la cuenta decide qué botones se ven. Las figuras muestran el nivel Premium, donde el estudiante tiene todas las acciones de este texto. Si tu nivel es Gratis, el capítulo final dice cuáles faltan.</w:t>
+        <w:t>Este manual es para quien entra como estudiante. El nombre de la aplicación es Aulivana-FCDdesign. El administrador decide si el alta de alumno, la de docente o las dos están abiertas. Los menús de docente y de administrador no están aquí. El nivel de la cuenta marca el tope: si una acción no aparece, ese nivel no la incluye.</w:t>
       </w:r>
     </w:p>
     <w:p>
@@ -89,14 +91,16 @@
       </w:r>
     </w:p>
     <w:p>
+      <w:pPr/>
       <w:r>
         <w:rPr>
           <w:rFonts w:ascii="Calibri" w:hAnsi="Calibri" w:cs="Calibri"/>
           <w:b w:val="0"/>
           <w:i w:val="0"/>
+          <w:color w:val="1E293B"/>
           <w:sz w:val="24"/>
         </w:rPr>
-        <w:t>La primera pantalla tiene tres pestañas: Entrar, Crear cuenta y Recuperar. Entrar pide el correo y la contraseña. Si el correo todavía no está confirmado, la aplicación lo dice y ofrece reenviar el mensaje.</w:t>
+        <w:t>La pantalla de entrada muestra la marca Aulivana y, debajo, FCDesign. Hay tres pestañas: Entrar, Crear cuenta y Recuperar.</w:t>
       </w:r>
     </w:p>
     <w:p>
@@ -106,7 +110,7 @@
       <w:r>
         <w:drawing>
           <wp:inline xmlns:a="http://schemas.openxmlformats.org/drawingml/2006/main" xmlns:pic="http://schemas.openxmlformats.org/drawingml/2006/picture">
-            <wp:extent cx="5852160" cy="3657600"/>
+            <wp:extent cx="5852160" cy="4403799"/>
             <wp:docPr id="1" name="Picture 1"/>
             <wp:cNvGraphicFramePr>
               <a:graphicFrameLocks noChangeAspect="1"/>
@@ -127,7 +131,7 @@
                   <pic:spPr>
                     <a:xfrm>
                       <a:off x="0" y="0"/>
-                      <a:ext cx="5852160" cy="3657600"/>
+                      <a:ext cx="5852160" cy="4403799"/>
                     </a:xfrm>
                     <a:prstGeom prst="rect"/>
                   </pic:spPr>
@@ -150,18 +154,33 @@
           <w:color w:val="475569"/>
           <w:sz w:val="20"/>
         </w:rPr>
-        <w:t>Figura 1. Pestaña Entrar.</w:t>
+        <w:t>Figura 1. Entrada de Aulivana-FCDdesign.</w:t>
       </w:r>
     </w:p>
     <w:p>
+      <w:pPr/>
       <w:r>
         <w:rPr>
           <w:rFonts w:ascii="Calibri" w:hAnsi="Calibri" w:cs="Calibri"/>
           <w:b w:val="0"/>
           <w:i w:val="0"/>
+          <w:color w:val="1E293B"/>
           <w:sz w:val="24"/>
         </w:rPr>
-        <w:t>Ejemplo. Escribes tu correo y tu contraseña y pulsas Entrar. Si los datos coinciden, se abre el editor. La cuenta nueva ya trae el proyecto Ejemplos, con algoritmos para probar los botones.</w:t>
+        <w:t>Escribe el correo y la contraseña y pulsa Entrar. La cuenta tiene que tener el correo confirmado. Si no, la aplicación pide abrir el enlace que llegó al correo.</w:t>
+      </w:r>
+    </w:p>
+    <w:p>
+      <w:pPr/>
+      <w:r>
+        <w:rPr>
+          <w:rFonts w:ascii="Calibri" w:hAnsi="Calibri" w:cs="Calibri"/>
+          <w:b w:val="0"/>
+          <w:i w:val="0"/>
+          <w:color w:val="1E293B"/>
+          <w:sz w:val="24"/>
+        </w:rPr>
+        <w:t>Ejemplo. Ana Ruiz entra con su correo de estudiante y llega al banco de trabajo, con el proyecto Ejemplos ya creado.</w:t>
       </w:r>
     </w:p>
     <w:p>
@@ -180,14 +199,16 @@
       </w:r>
     </w:p>
     <w:p>
+      <w:pPr/>
       <w:r>
         <w:rPr>
           <w:rFonts w:ascii="Calibri" w:hAnsi="Calibri" w:cs="Calibri"/>
           <w:b w:val="0"/>
           <w:i w:val="0"/>
+          <w:color w:val="1E293B"/>
           <w:sz w:val="24"/>
         </w:rPr>
-        <w:t>Crear cuenta pide el nombre visible, el perfil, el correo y la contraseña. El perfil de este manual es Estudiante. Docente es otra cuenta: no abre los mismos menús. El nombre puede tener hasta 80 caracteres. La contraseña tiene que cumplir las reglas del servidor; una muy corta se rechaza.</w:t>
+        <w:t>Crear cuenta pide un nombre visible, el perfil, el correo y la contraseña. Si el administrador dejó abiertos los dos perfiles, el formulario ofrece Estudiante y Docente. Si solo quedó uno, no hay lista: el texto dice que la cuenta será de ese perfil.</w:t>
       </w:r>
     </w:p>
     <w:p>
@@ -197,7 +218,7 @@
       <w:r>
         <w:drawing>
           <wp:inline xmlns:a="http://schemas.openxmlformats.org/drawingml/2006/main" xmlns:pic="http://schemas.openxmlformats.org/drawingml/2006/picture">
-            <wp:extent cx="5852160" cy="3657600"/>
+            <wp:extent cx="5852160" cy="4403799"/>
             <wp:docPr id="2" name="Picture 2"/>
             <wp:cNvGraphicFramePr>
               <a:graphicFrameLocks noChangeAspect="1"/>
@@ -218,7 +239,7 @@
                   <pic:spPr>
                     <a:xfrm>
                       <a:off x="0" y="0"/>
-                      <a:ext cx="5852160" cy="3657600"/>
+                      <a:ext cx="5852160" cy="4403799"/>
                     </a:xfrm>
                     <a:prstGeom prst="rect"/>
                   </pic:spPr>
@@ -241,18 +262,33 @@
           <w:color w:val="475569"/>
           <w:sz w:val="20"/>
         </w:rPr>
-        <w:t>Figura 2. Pestaña Crear cuenta, con el perfil Estudiante.</w:t>
+        <w:t>Figura 2. Alta con el perfil Estudiante.</w:t>
       </w:r>
     </w:p>
     <w:p>
+      <w:pPr/>
       <w:r>
         <w:rPr>
           <w:rFonts w:ascii="Calibri" w:hAnsi="Calibri" w:cs="Calibri"/>
           <w:b w:val="0"/>
           <w:i w:val="0"/>
+          <w:color w:val="1E293B"/>
           <w:sz w:val="24"/>
         </w:rPr>
-        <w:t>Ejemplo. Nombre Ana Ruiz, perfil Estudiante, tu correo y una contraseña. Si la instalación pide confirmar el correo, abres el enlace del mensaje y después entras. Si no lo pide, la sesión empieza al crear la cuenta. El alta asigna el nivel Gratis del estudiante, salvo que quien administra la instalación haya dejado otro nivel de entrada.</w:t>
+        <w:t>Al enviar, la cuenta queda pendiente hasta abrir el enlace del correo. Ese enlace confirma la cuenta aunque se abra en otro equipo. Si ese navegador ya tiene otra sesión, no la sustituye. Repetir el alta con el mismo correo pendiente actualiza la contraseña y vuelve a enviar el mensaje.</w:t>
+      </w:r>
+    </w:p>
+    <w:p>
+      <w:pPr/>
+      <w:r>
+        <w:rPr>
+          <w:rFonts w:ascii="Calibri" w:hAnsi="Calibri" w:cs="Calibri"/>
+          <w:b w:val="0"/>
+          <w:i w:val="0"/>
+          <w:color w:val="1E293B"/>
+          <w:sz w:val="24"/>
+        </w:rPr>
+        <w:t>Ejemplo. Un alumno nuevo elige Estudiante, escribe su nombre y su correo, y espera el enlace antes de pulsar Entrar.</w:t>
       </w:r>
     </w:p>
     <w:p>
@@ -271,14 +307,16 @@
       </w:r>
     </w:p>
     <w:p>
+      <w:pPr/>
       <w:r>
         <w:rPr>
           <w:rFonts w:ascii="Calibri" w:hAnsi="Calibri" w:cs="Calibri"/>
           <w:b w:val="0"/>
           <w:i w:val="0"/>
+          <w:color w:val="1E293B"/>
           <w:sz w:val="24"/>
         </w:rPr>
-        <w:t>Recuperar pide solo el correo. Enviar instrucciones manda un enlace. Ese enlace abre la misma aplicación en la pestaña de contraseña nueva. Al guardarla, vuelves a Entrar y usas la nueva.</w:t>
+        <w:t>Recuperar pide solo el correo. Enviar instrucciones manda un enlace para elegir otra contraseña. El enlace usa el mismo correo que la confirmación.</w:t>
       </w:r>
     </w:p>
     <w:p>
@@ -288,7 +326,7 @@
       <w:r>
         <w:drawing>
           <wp:inline xmlns:a="http://schemas.openxmlformats.org/drawingml/2006/main" xmlns:pic="http://schemas.openxmlformats.org/drawingml/2006/picture">
-            <wp:extent cx="5852160" cy="3657600"/>
+            <wp:extent cx="5852160" cy="4403799"/>
             <wp:docPr id="3" name="Picture 3"/>
             <wp:cNvGraphicFramePr>
               <a:graphicFrameLocks noChangeAspect="1"/>
@@ -309,7 +347,7 @@
                   <pic:spPr>
                     <a:xfrm>
                       <a:off x="0" y="0"/>
-                      <a:ext cx="5852160" cy="3657600"/>
+                      <a:ext cx="5852160" cy="4403799"/>
                     </a:xfrm>
                     <a:prstGeom prst="rect"/>
                   </pic:spPr>
@@ -332,18 +370,20 @@
           <w:color w:val="475569"/>
           <w:sz w:val="20"/>
         </w:rPr>
-        <w:t>Figura 3. Pestaña Recuperar.</w:t>
+        <w:t>Figura 3. Pedir instrucciones para una contraseña nueva.</w:t>
       </w:r>
     </w:p>
     <w:p>
+      <w:pPr/>
       <w:r>
         <w:rPr>
           <w:rFonts w:ascii="Calibri" w:hAnsi="Calibri" w:cs="Calibri"/>
           <w:b w:val="0"/>
           <w:i w:val="0"/>
+          <w:color w:val="1E293B"/>
           <w:sz w:val="24"/>
         </w:rPr>
-        <w:t>Ejemplo. Olvidaste la contraseña. Escribes el correo de la cuenta, pulsas Enviar instrucciones, abres el enlace, eliges una contraseña nueva y entras con ella. El enlace no cambia el nombre ni la foto.</w:t>
+        <w:t>Ejemplo. Si Ana no recuerda la contraseña, escribe alumno.manual@ejemplo.test y abre el mensaje. La contraseña anterior deja de servir cuando guarda la nueva.</w:t>
       </w:r>
     </w:p>
     <w:p>
@@ -358,40 +398,20 @@
           <w:color w:val="3D2A5C"/>
           <w:sz w:val="44"/>
         </w:rPr>
-        <w:t>4. Perfil, puntos y puesto</w:t>
+        <w:t>4. El banco de trabajo</w:t>
       </w:r>
     </w:p>
     <w:p>
+      <w:pPr/>
       <w:r>
         <w:rPr>
           <w:rFonts w:ascii="Calibri" w:hAnsi="Calibri" w:cs="Calibri"/>
           <w:b w:val="0"/>
           <w:i w:val="0"/>
+          <w:color w:val="1E293B"/>
           <w:sz w:val="24"/>
         </w:rPr>
-        <w:t>Arriba a la izquierda están tus iniciales o tu foto, el nombre, la palabra Estudiante y el nombre del nivel. Al lado, los puntos, el puesto y, si el nivel tiene fecha, los días que faltan. El puesto es tu lugar entre las cuentas, según los puntos. Los puntos suben al completar un reto del laboratorio.</w:t>
-      </w:r>
-    </w:p>
-    <w:p>
-      <w:r>
-        <w:rPr>
-          <w:rFonts w:ascii="Calibri" w:hAnsi="Calibri" w:cs="Calibri"/>
-          <w:b w:val="0"/>
-          <w:i w:val="0"/>
-          <w:sz w:val="24"/>
-        </w:rPr>
-        <w:t>El círculo abre Personalizar perfil. Ahí cambias el nombre, la foto y la contraseña. La foto es JPG o PNG; la aplicación la guarda como un cuadrado pequeño. Quitar imagen vuelve a las iniciales. El tipo de cuenta no se cambia en esta ventana: sigues siendo estudiante.</w:t>
-      </w:r>
-    </w:p>
-    <w:p>
-      <w:r>
-        <w:rPr>
-          <w:rFonts w:ascii="Calibri" w:hAnsi="Calibri" w:cs="Calibri"/>
-          <w:b w:val="0"/>
-          <w:i w:val="0"/>
-          <w:sz w:val="24"/>
-        </w:rPr>
-        <w:t>La contraseña se deja en blanco si no quieres cambiarla. Si escribes una nueva, hacen falta la actual, la nueva y la repetición. Las dos nuevas tienen que coincidir.</w:t>
+        <w:t>Arriba están el nombre, los puntos, el puesto, los días del nivel y los menús. A la izquierda, los proyectos y los algoritmos. En el centro, el pseudocódigo. A la derecha, el diagrama del mismo algoritmo.</w:t>
       </w:r>
     </w:p>
     <w:p>
@@ -401,7 +421,7 @@
       <w:r>
         <w:drawing>
           <wp:inline xmlns:a="http://schemas.openxmlformats.org/drawingml/2006/main" xmlns:pic="http://schemas.openxmlformats.org/drawingml/2006/picture">
-            <wp:extent cx="5852160" cy="3657600"/>
+            <wp:extent cx="5852160" cy="4403799"/>
             <wp:docPr id="4" name="Picture 4"/>
             <wp:cNvGraphicFramePr>
               <a:graphicFrameLocks noChangeAspect="1"/>
@@ -410,7 +430,7 @@
               <a:graphicData uri="http://schemas.openxmlformats.org/drawingml/2006/picture">
                 <pic:pic>
                   <pic:nvPicPr>
-                    <pic:cNvPr id="0" name="07-perfil.png"/>
+                    <pic:cNvPr id="0" name="04-editor.png"/>
                     <pic:cNvPicPr/>
                   </pic:nvPicPr>
                   <pic:blipFill>
@@ -422,7 +442,7 @@
                   <pic:spPr>
                     <a:xfrm>
                       <a:off x="0" y="0"/>
-                      <a:ext cx="5852160" cy="3657600"/>
+                      <a:ext cx="5852160" cy="4403799"/>
                     </a:xfrm>
                     <a:prstGeom prst="rect"/>
                   </pic:spPr>
@@ -445,423 +465,33 @@
           <w:color w:val="475569"/>
           <w:sz w:val="20"/>
         </w:rPr>
-        <w:t>Figura 4. Personalizar perfil.</w:t>
+        <w:t>Figura 4. Banco de trabajo con el algoritmo Área de un triángulo.</w:t>
       </w:r>
     </w:p>
     <w:p>
+      <w:pPr/>
       <w:r>
         <w:rPr>
           <w:rFonts w:ascii="Calibri" w:hAnsi="Calibri" w:cs="Calibri"/>
           <w:b w:val="0"/>
           <w:i w:val="0"/>
+          <w:color w:val="1E293B"/>
           <w:sz w:val="24"/>
         </w:rPr>
-        <w:t>Ejemplo. Quieres que el nombre diga Ana R. Lo escribes, dejas las contraseñas vacías y pulsas Guardar. El nombre de la barra cambia y la sesión sigue abierta. Para cambiar la clave, escribes la actual, la nueva y la misma nueva otra vez.</w:t>
+        <w:t>Nuevo proyecto y Crear proyecto agregan una carpeta. Nuevo algoritmo y Crear algoritmo agregan un archivo dentro del proyecto elegido. El lápiz cambia el nombre. La flecha descarga el texto. La cruz elimina. El proyecto Ejemplos y sus trece algoritmos no cuentan para el cupo del nivel.</w:t>
       </w:r>
     </w:p>
     <w:p>
-      <w:pPr>
-        <w:pStyle w:val="Heading1"/>
-      </w:pPr>
-      <w:r>
-        <w:rPr>
-          <w:rFonts w:ascii="Calibri" w:hAnsi="Calibri" w:cs="Calibri"/>
-          <w:b/>
-          <w:i w:val="0"/>
-          <w:color w:val="3D2A5C"/>
-          <w:sz w:val="44"/>
-        </w:rPr>
-        <w:t>5. Si el navegador solo muestra la cuenta</w:t>
-      </w:r>
-    </w:p>
-    <w:p>
+      <w:pPr/>
       <w:r>
         <w:rPr>
           <w:rFonts w:ascii="Calibri" w:hAnsi="Calibri" w:cs="Calibri"/>
           <w:b w:val="0"/>
           <w:i w:val="0"/>
+          <w:color w:val="1E293B"/>
           <w:sz w:val="24"/>
         </w:rPr>
-        <w:t>Algunos niveles no abren la aplicación en el navegador. Entran, y lo único que queda es tu cuenta: el perfil, el nivel y el tiempo. Salir cierra la sesión. El editor, el laboratorio y el diagrama se usan en la aplicación de escritorio, que sí está autorizada para esa cuenta.</w:t>
-      </w:r>
-    </w:p>
-    <w:p>
-      <w:pPr>
-        <w:jc w:val="center"/>
-      </w:pPr>
-      <w:r>
-        <w:drawing>
-          <wp:inline xmlns:a="http://schemas.openxmlformats.org/drawingml/2006/main" xmlns:pic="http://schemas.openxmlformats.org/drawingml/2006/picture">
-            <wp:extent cx="5852160" cy="3657600"/>
-            <wp:docPr id="5" name="Picture 5"/>
-            <wp:cNvGraphicFramePr>
-              <a:graphicFrameLocks noChangeAspect="1"/>
-            </wp:cNvGraphicFramePr>
-            <a:graphic>
-              <a:graphicData uri="http://schemas.openxmlformats.org/drawingml/2006/picture">
-                <pic:pic>
-                  <pic:nvPicPr>
-                    <pic:cNvPr id="0" name="17-cuenta.png"/>
-                    <pic:cNvPicPr/>
-                  </pic:nvPicPr>
-                  <pic:blipFill>
-                    <a:blip r:embed="rId13"/>
-                    <a:stretch>
-                      <a:fillRect/>
-                    </a:stretch>
-                  </pic:blipFill>
-                  <pic:spPr>
-                    <a:xfrm>
-                      <a:off x="0" y="0"/>
-                      <a:ext cx="5852160" cy="3657600"/>
-                    </a:xfrm>
-                    <a:prstGeom prst="rect"/>
-                  </pic:spPr>
-                </pic:pic>
-              </a:graphicData>
-            </a:graphic>
-          </wp:inline>
-        </w:drawing>
-      </w:r>
-    </w:p>
-    <w:p>
-      <w:pPr>
-        <w:jc w:val="center"/>
-      </w:pPr>
-      <w:r>
-        <w:rPr>
-          <w:rFonts w:ascii="Calibri" w:hAnsi="Calibri" w:cs="Calibri"/>
-          <w:b w:val="0"/>
-          <w:i/>
-          <w:color w:val="475569"/>
-          <w:sz w:val="20"/>
-        </w:rPr>
-        <w:t>Figura 5. Cuenta cuando el navegador no abre el resto.</w:t>
-      </w:r>
-    </w:p>
-    <w:p>
-      <w:r>
-        <w:rPr>
-          <w:rFonts w:ascii="Calibri" w:hAnsi="Calibri" w:cs="Calibri"/>
-          <w:b w:val="0"/>
-          <w:i w:val="0"/>
-          <w:sz w:val="24"/>
-        </w:rPr>
-        <w:t>Ejemplo. Entras en el navegador del colegio y ves esta tarjeta. Puedes cambiar la foto y la contraseña. Para escribir un algoritmo, abres Aulivana-FCDdesign en la aplicación de escritorio con la misma cuenta.</w:t>
-      </w:r>
-    </w:p>
-    <w:p>
-      <w:pPr>
-        <w:pStyle w:val="Heading1"/>
-      </w:pPr>
-      <w:r>
-        <w:rPr>
-          <w:rFonts w:ascii="Calibri" w:hAnsi="Calibri" w:cs="Calibri"/>
-          <w:b/>
-          <w:i w:val="0"/>
-          <w:color w:val="3D2A5C"/>
-          <w:sz w:val="44"/>
-        </w:rPr>
-        <w:t>6. La barra del editor</w:t>
-      </w:r>
-    </w:p>
-    <w:p>
-      <w:r>
-        <w:rPr>
-          <w:rFonts w:ascii="Calibri" w:hAnsi="Calibri" w:cs="Calibri"/>
-          <w:b w:val="0"/>
-          <w:i w:val="0"/>
-          <w:sz w:val="24"/>
-        </w:rPr>
-        <w:t>Con el nivel que incluye el editor, la barra de arriba tiene estas acciones:</w:t>
-      </w:r>
-    </w:p>
-    <w:p>
-      <w:pPr>
-        <w:pStyle w:val="ListBullet"/>
-      </w:pPr>
-      <w:r>
-        <w:rPr>
-          <w:rFonts w:ascii="Calibri" w:hAnsi="Calibri" w:cs="Calibri"/>
-          <w:b w:val="0"/>
-          <w:i w:val="0"/>
-          <w:sz w:val="24"/>
-        </w:rPr>
-        <w:t>Actualizar vuelve a pedir la cuenta y los proyectos. Sirve cuando la misma cuenta está abierta en otra ventana. En el editor, suelta el texto que todavía no guardaste y cierra la ejecución en curso.</w:t>
-      </w:r>
-    </w:p>
-    <w:p>
-      <w:pPr>
-        <w:pStyle w:val="ListBullet"/>
-      </w:pPr>
-      <w:r>
-        <w:rPr>
-          <w:rFonts w:ascii="Calibri" w:hAnsi="Calibri" w:cs="Calibri"/>
-          <w:b w:val="0"/>
-          <w:i w:val="0"/>
-          <w:sz w:val="24"/>
-        </w:rPr>
-        <w:t>Laboratorio abre las rutas y la práctica libre.</w:t>
-      </w:r>
-    </w:p>
-    <w:p>
-      <w:pPr>
-        <w:pStyle w:val="ListBullet"/>
-      </w:pPr>
-      <w:r>
-        <w:rPr>
-          <w:rFonts w:ascii="Calibri" w:hAnsi="Calibri" w:cs="Calibri"/>
-          <w:b w:val="0"/>
-          <w:i w:val="0"/>
-          <w:sz w:val="24"/>
-        </w:rPr>
-        <w:t>Armar diagrama abre el lienzo de figuras. Solo aparece si el nivel lo incluye.</w:t>
-      </w:r>
-    </w:p>
-    <w:p>
-      <w:pPr>
-        <w:pStyle w:val="ListBullet"/>
-      </w:pPr>
-      <w:r>
-        <w:rPr>
-          <w:rFonts w:ascii="Calibri" w:hAnsi="Calibri" w:cs="Calibri"/>
-          <w:b w:val="0"/>
-          <w:i w:val="0"/>
-          <w:sz w:val="24"/>
-        </w:rPr>
-        <w:t>Funciones lista las operaciones que ya vienen con el lenguaje.</w:t>
-      </w:r>
-    </w:p>
-    <w:p>
-      <w:pPr>
-        <w:pStyle w:val="ListBullet"/>
-        <w:spacing w:after="40"/>
-      </w:pPr>
-      <w:r>
-        <w:rPr>
-          <w:rFonts w:ascii="Calibri" w:hAnsi="Calibri" w:cs="Calibri"/>
-          <w:b w:val="0"/>
-          <w:i w:val="0"/>
-          <w:color w:val="1E1B2E"/>
-          <w:sz w:val="24"/>
-        </w:rPr>
-        <w:t>Operadores abre cada símbolo y el orden en que se ligan. No escribe nada en el algoritmo.</w:t>
-      </w:r>
-    </w:p>
-    <w:p>
-      <w:pPr>
-        <w:pStyle w:val="ListBullet"/>
-        <w:spacing w:after="40"/>
-      </w:pPr>
-      <w:r>
-        <w:rPr>
-          <w:rFonts w:ascii="Calibri" w:hAnsi="Calibri" w:cs="Calibri"/>
-          <w:b w:val="0"/>
-          <w:i w:val="0"/>
-          <w:color w:val="1E1B2E"/>
-          <w:sz w:val="24"/>
-        </w:rPr>
-        <w:t>Manuales abre el manual del lenguaje y este manual. Ver lo muestra en la aplicación. Descargar PDF guarda el archivo.</w:t>
-      </w:r>
-    </w:p>
-    <w:p>
-      <w:pPr>
-        <w:pStyle w:val="ListBullet"/>
-      </w:pPr>
-      <w:r>
-        <w:rPr>
-          <w:rFonts w:ascii="Calibri" w:hAnsi="Calibri" w:cs="Calibri"/>
-          <w:b w:val="0"/>
-          <w:i w:val="0"/>
-          <w:sz w:val="24"/>
-        </w:rPr>
-        <w:t>Configuración guarda idioma, tamaño, modo, punto y coma e índice.</w:t>
-      </w:r>
-    </w:p>
-    <w:p>
-      <w:pPr>
-        <w:pStyle w:val="ListBullet"/>
-      </w:pPr>
-      <w:r>
-        <w:rPr>
-          <w:rFonts w:ascii="Calibri" w:hAnsi="Calibri" w:cs="Calibri"/>
-          <w:b w:val="0"/>
-          <w:i w:val="0"/>
-          <w:sz w:val="24"/>
-        </w:rPr>
-        <w:t>Salir cierra la sesión.</w:t>
-      </w:r>
-    </w:p>
-    <w:p>
-      <w:r>
-        <w:rPr>
-          <w:rFonts w:ascii="Calibri" w:hAnsi="Calibri" w:cs="Calibri"/>
-          <w:b w:val="0"/>
-          <w:i w:val="0"/>
-          <w:sz w:val="24"/>
-        </w:rPr>
-        <w:t>En una ventana ancha, el editor y el diagrama se ven juntos. En una ventana estrecha, la barra muestra dos pestañas, Editor y Diagrama, y se ve una cada vez. El diagrama también se puede plegar con el botón menos de su panel.</w:t>
-      </w:r>
-    </w:p>
-    <w:p>
-      <w:pPr>
-        <w:jc w:val="center"/>
-      </w:pPr>
-      <w:r>
-        <w:drawing>
-          <wp:inline xmlns:a="http://schemas.openxmlformats.org/drawingml/2006/main" xmlns:pic="http://schemas.openxmlformats.org/drawingml/2006/picture">
-            <wp:extent cx="5852160" cy="3657600"/>
-            <wp:docPr id="6" name="Picture 6"/>
-            <wp:cNvGraphicFramePr>
-              <a:graphicFrameLocks noChangeAspect="1"/>
-            </wp:cNvGraphicFramePr>
-            <a:graphic>
-              <a:graphicData uri="http://schemas.openxmlformats.org/drawingml/2006/picture">
-                <pic:pic>
-                  <pic:nvPicPr>
-                    <pic:cNvPr id="0" name="04-editor.png"/>
-                    <pic:cNvPicPr/>
-                  </pic:nvPicPr>
-                  <pic:blipFill>
-                    <a:blip r:embed="rId14"/>
-                    <a:stretch>
-                      <a:fillRect/>
-                    </a:stretch>
-                  </pic:blipFill>
-                  <pic:spPr>
-                    <a:xfrm>
-                      <a:off x="0" y="0"/>
-                      <a:ext cx="5852160" cy="3657600"/>
-                    </a:xfrm>
-                    <a:prstGeom prst="rect"/>
-                  </pic:spPr>
-                </pic:pic>
-              </a:graphicData>
-            </a:graphic>
-          </wp:inline>
-        </w:drawing>
-      </w:r>
-    </w:p>
-    <w:p>
-      <w:pPr>
-        <w:jc w:val="center"/>
-      </w:pPr>
-      <w:r>
-        <w:rPr>
-          <w:rFonts w:ascii="Calibri" w:hAnsi="Calibri" w:cs="Calibri"/>
-          <w:b w:val="0"/>
-          <w:i/>
-          <w:color w:val="475569"/>
-          <w:sz w:val="20"/>
-        </w:rPr>
-        <w:t>Figura 6. Editor, proyectos, consola, diagrama, depurador y diagnósticos.</w:t>
-      </w:r>
-    </w:p>
-    <w:p>
-      <w:r>
-        <w:rPr>
-          <w:rFonts w:ascii="Calibri" w:hAnsi="Calibri" w:cs="Calibri"/>
-          <w:b w:val="0"/>
-          <w:i w:val="0"/>
-          <w:sz w:val="24"/>
-        </w:rPr>
-        <w:t>La franja naranja de la figura solo aparece en la instalación de desarrollo. Recuerda que esa ejecución no es el aislamiento de un servidor de producción. En otra instalación puede no estar.</w:t>
-      </w:r>
-    </w:p>
-    <w:p>
-      <w:pPr>
-        <w:pStyle w:val="Heading1"/>
-      </w:pPr>
-      <w:r>
-        <w:rPr>
-          <w:rFonts w:ascii="Calibri" w:hAnsi="Calibri" w:cs="Calibri"/>
-          <w:b/>
-          <w:i w:val="0"/>
-          <w:color w:val="3D2A5C"/>
-          <w:sz w:val="44"/>
-        </w:rPr>
-        <w:t>7. Proyectos y algoritmos</w:t>
-      </w:r>
-    </w:p>
-    <w:p>
-      <w:r>
-        <w:rPr>
-          <w:rFonts w:ascii="Calibri" w:hAnsi="Calibri" w:cs="Calibri"/>
-          <w:b w:val="0"/>
-          <w:i w:val="0"/>
-          <w:sz w:val="24"/>
-        </w:rPr>
-        <w:t>La columna izquierda lista tus proyectos. Pulsas el nombre para abrirlo. El lápiz lo renombra: escribes el nombre nuevo y confirmas con Enter. Escape cancela. Abajo, Nuevo proyecto y Crear proyecto añaden uno. El nivel puede limitar cuántos proyectos y cuántos algoritmos puedes crear. El proyecto Ejemplos, el que llega con la cuenta, no cuenta para ese tope.</w:t>
-      </w:r>
-    </w:p>
-    <w:p>
-      <w:r>
-        <w:rPr>
-          <w:rFonts w:ascii="Calibri" w:hAnsi="Calibri" w:cs="Calibri"/>
-          <w:b w:val="0"/>
-          <w:i w:val="0"/>
-          <w:sz w:val="24"/>
-        </w:rPr>
-        <w:t>Dentro del proyecto están los algoritmos. Pulsar el nombre lo abre en el editor. El lápiz lo renombra. La flecha lo descarga como archivo de texto, si el nivel incluye descargar. La cruz lo elimina: antes pregunta si de verdad quieres borrar ese nombre.</w:t>
-      </w:r>
-    </w:p>
-    <w:p>
-      <w:r>
-        <w:rPr>
-          <w:rFonts w:ascii="Calibri" w:hAnsi="Calibri" w:cs="Calibri"/>
-          <w:b w:val="0"/>
-          <w:i w:val="0"/>
-          <w:sz w:val="24"/>
-        </w:rPr>
-        <w:t>Ejemplo. En Nuevo proyecto escribes Tareas y pulsas Crear proyecto. En Nuevo algoritmo escribes Suma y pulsas Crear algoritmo. Suma queda vacío para que lo escribas. Si llegas al tope, el formulario de crear desaparece hasta que el nivel permita más.</w:t>
-      </w:r>
-    </w:p>
-    <w:p>
-      <w:pPr>
-        <w:pStyle w:val="Heading1"/>
-      </w:pPr>
-      <w:r>
-        <w:rPr>
-          <w:rFonts w:ascii="Calibri" w:hAnsi="Calibri" w:cs="Calibri"/>
-          <w:b/>
-          <w:i w:val="0"/>
-          <w:color w:val="3D2A5C"/>
-          <w:sz w:val="44"/>
-        </w:rPr>
-        <w:t>8. Escribir en el editor</w:t>
-      </w:r>
-    </w:p>
-    <w:p>
-      <w:r>
-        <w:rPr>
-          <w:rFonts w:ascii="Calibri" w:hAnsi="Calibri" w:cs="Calibri"/>
-          <w:b w:val="0"/>
-          <w:i w:val="0"/>
-          <w:sz w:val="24"/>
-        </w:rPr>
-        <w:t>El centro es el texto del algoritmo. Las palabras del lenguaje se colorean. La barra de estado dice si está guardado, si hay cambios y en qué línea está el cursor. Guardar versión deja una copia numerada del texto. No hace falta pulsarla para ejecutar: Ejecutar usa lo que está en pantalla.</w:t>
-      </w:r>
-    </w:p>
-    <w:p>
-      <w:r>
-        <w:rPr>
-          <w:rFonts w:ascii="Calibri" w:hAnsi="Calibri" w:cs="Calibri"/>
-          <w:b w:val="0"/>
-          <w:i w:val="0"/>
-          <w:sz w:val="24"/>
-        </w:rPr>
-        <w:t>Puedes escribir siempre. Pegar texto es otra cosa. Si tu nivel no incluye pegar, o si un docente lo apagó para tu grupo o para ti, el editor rechaza el pegado y lo dice en la barra de estado. El teclado sigue sirviendo.</w:t>
-      </w:r>
-    </w:p>
-    <w:p>
-      <w:r>
-        <w:rPr>
-          <w:rFonts w:ascii="Calibri" w:hAnsi="Calibri" w:cs="Calibri"/>
-          <w:b w:val="0"/>
-          <w:i w:val="0"/>
-          <w:sz w:val="24"/>
-        </w:rPr>
-        <w:t>Ejemplo. Abres Área de un triángulo, del proyecto Ejemplos. El texto pide la base y la altura, calcula el área y la escribe:</w:t>
+        <w:t>Ejemplo. En Ejemplos está abierto Área de un triángulo. El algoritmo lee la base y la altura, calcula el área y la escribe. El diagrama de la derecha sigue al mismo texto. Guardar versión deja una copia en la cuenta.</w:t>
       </w:r>
     </w:p>
     <w:tbl>
@@ -876,18 +506,25 @@
         <w:tc>
           <w:tcPr>
             <w:tcW w:type="dxa" w:w="9648"/>
+            <w:shd w:val="clear" w:color="auto" w:fill="F7F4EC"/>
             <w:tcW w:w="9866" w:type="dxa"/>
           </w:tcPr>
           <w:p>
-            <w:pPr>
-              <w:shd w:val="clear" w:color="auto" w:fill="F7F4EC"/>
-            </w:pPr>
-            <w:r/>
             <w:r>
               <w:rPr>
                 <w:rFonts w:ascii="Menlo" w:hAnsi="Menlo" w:cs="Menlo"/>
                 <w:b w:val="0"/>
                 <w:i w:val="0"/>
+                <w:color w:val="1E293B"/>
+                <w:sz w:val="21"/>
+              </w:rPr>
+            </w:r>
+            <w:r>
+              <w:rPr>
+                <w:rFonts w:ascii="Menlo" w:hAnsi="Menlo" w:cs="Menlo"/>
+                <w:b w:val="0"/>
+                <w:i w:val="0"/>
+                <w:color w:val="1E293B"/>
                 <w:sz w:val="21"/>
               </w:rPr>
               <w:t>Algoritmo AreaTriangulo</w:t>
@@ -912,17 +549,7 @@
         </w:tc>
       </w:tr>
     </w:tbl>
-    <w:p>
-      <w:r>
-        <w:rPr>
-          <w:rFonts w:ascii="Calibri" w:hAnsi="Calibri" w:cs="Calibri"/>
-          <w:b w:val="0"/>
-          <w:i w:val="0"/>
-          <w:sz w:val="24"/>
-        </w:rPr>
-        <w:t>Si escribes base 4 y altura 3, el área es 6. Cada Leer espera en la consola: escribes el número y pulsas Enviar.</w:t>
-      </w:r>
-    </w:p>
+    <w:p/>
     <w:p>
       <w:pPr>
         <w:pStyle w:val="Heading1"/>
@@ -935,55 +562,20 @@
           <w:color w:val="3D2A5C"/>
           <w:sz w:val="44"/>
         </w:rPr>
-        <w:t>9. Validar</w:t>
+        <w:t>5. Funciones</w:t>
       </w:r>
     </w:p>
     <w:p>
+      <w:pPr/>
       <w:r>
         <w:rPr>
           <w:rFonts w:ascii="Calibri" w:hAnsi="Calibri" w:cs="Calibri"/>
           <w:b w:val="0"/>
           <w:i w:val="0"/>
+          <w:color w:val="1E293B"/>
           <w:sz w:val="24"/>
         </w:rPr>
-        <w:t>Validar revisa el texto y no lo ejecuta. Si no hay fallos, Diagnósticos dice que no hay. Si hay un fallo, la lista marca error o aviso, con la línea y la columna. Corriges el texto y vuelves a validar. Traducir y Ejecutar también se detienen si el texto tiene errores.</w:t>
-      </w:r>
-    </w:p>
-    <w:p>
-      <w:r>
-        <w:rPr>
-          <w:rFonts w:ascii="Calibri" w:hAnsi="Calibri" w:cs="Calibri"/>
-          <w:b w:val="0"/>
-          <w:i w:val="0"/>
-          <w:sz w:val="24"/>
-        </w:rPr>
-        <w:t>Ejemplo. En Hola mundo quitas el punto y coma del Escribir y pulsas Validar. Diagnósticos señala esa línea. Lo devuelves y Validar queda otra vez sin diagnósticos. El algoritmo no llega a escribir nada durante esa revisión.</w:t>
-      </w:r>
-    </w:p>
-    <w:p>
-      <w:pPr>
-        <w:pStyle w:val="Heading1"/>
-      </w:pPr>
-      <w:r>
-        <w:rPr>
-          <w:rFonts w:ascii="Calibri" w:hAnsi="Calibri" w:cs="Calibri"/>
-          <w:b/>
-          <w:i w:val="0"/>
-          <w:color w:val="3D2A5C"/>
-          <w:sz w:val="44"/>
-        </w:rPr>
-        <w:t>10. Ejecutar</w:t>
-      </w:r>
-    </w:p>
-    <w:p>
-      <w:r>
-        <w:rPr>
-          <w:rFonts w:ascii="Calibri" w:hAnsi="Calibri" w:cs="Calibri"/>
-          <w:b w:val="0"/>
-          <w:i w:val="0"/>
-          <w:sz w:val="24"/>
-        </w:rPr>
-        <w:t>Ejecutar recorre el algoritmo y escribe en la consola negra. Si el algoritmo pide un dato, la consola espera y el botón Enviar manda lo que escribiste. Detener corta esa ejecución. La consola se puede hacer más alta o más baja arrastrando la barra que la separa del editor.</w:t>
+        <w:t>Funciones abre la lista de operaciones que ya vienen con el lenguaje. No modifican el algoritmo. Sirven para copiar el nombre y los argumentos a una expresión.</w:t>
       </w:r>
     </w:p>
     <w:p>
@@ -993,8 +585,8 @@
       <w:r>
         <w:drawing>
           <wp:inline xmlns:a="http://schemas.openxmlformats.org/drawingml/2006/main" xmlns:pic="http://schemas.openxmlformats.org/drawingml/2006/picture">
-            <wp:extent cx="5852160" cy="3657600"/>
-            <wp:docPr id="7" name="Picture 7"/>
+            <wp:extent cx="5852160" cy="4403799"/>
+            <wp:docPr id="5" name="Picture 5"/>
             <wp:cNvGraphicFramePr>
               <a:graphicFrameLocks noChangeAspect="1"/>
             </wp:cNvGraphicFramePr>
@@ -1002,11 +594,11 @@
               <a:graphicData uri="http://schemas.openxmlformats.org/drawingml/2006/picture">
                 <pic:pic>
                   <pic:nvPicPr>
-                    <pic:cNvPr id="0" name="08-ejecutar.png"/>
+                    <pic:cNvPr id="0" name="05-funciones.png"/>
                     <pic:cNvPicPr/>
                   </pic:nvPicPr>
                   <pic:blipFill>
-                    <a:blip r:embed="rId15"/>
+                    <a:blip r:embed="rId13"/>
                     <a:stretch>
                       <a:fillRect/>
                     </a:stretch>
@@ -1014,7 +606,7 @@
                   <pic:spPr>
                     <a:xfrm>
                       <a:off x="0" y="0"/>
-                      <a:ext cx="5852160" cy="3657600"/>
+                      <a:ext cx="5852160" cy="4403799"/>
                     </a:xfrm>
                     <a:prstGeom prst="rect"/>
                   </pic:spPr>
@@ -1037,65 +629,20 @@
           <w:color w:val="475569"/>
           <w:sz w:val="20"/>
         </w:rPr>
-        <w:t>Figura 7. Hola mundo ya ejecutado: la consola muestra el texto.</w:t>
+        <w:t>Figura 5. Funciones incluidas, de Abs a ConvertirATexto.</w:t>
       </w:r>
     </w:p>
     <w:p>
+      <w:pPr/>
       <w:r>
         <w:rPr>
           <w:rFonts w:ascii="Calibri" w:hAnsi="Calibri" w:cs="Calibri"/>
           <w:b w:val="0"/>
           <w:i w:val="0"/>
+          <w:color w:val="1E293B"/>
           <w:sz w:val="24"/>
         </w:rPr>
-        <w:t>Ejemplo. Abres Hola mundo y pulsas Ejecutar. El algoritmo es este:</w:t>
-      </w:r>
-    </w:p>
-    <w:tbl>
-      <w:tblPr>
-        <w:tblW w:type="auto" w:w="0"/>
-        <w:tblLook w:firstColumn="1" w:firstRow="1" w:lastColumn="0" w:lastRow="0" w:noHBand="0" w:noVBand="1" w:val="04A0"/>
-      </w:tblPr>
-      <w:tblGrid>
-        <w:gridCol w:w="9648"/>
-      </w:tblGrid>
-      <w:tr>
-        <w:tc>
-          <w:tcPr>
-            <w:tcW w:type="dxa" w:w="9648"/>
-            <w:tcW w:w="9866" w:type="dxa"/>
-          </w:tcPr>
-          <w:p>
-            <w:pPr>
-              <w:shd w:val="clear" w:color="auto" w:fill="F7F4EC"/>
-            </w:pPr>
-            <w:r/>
-            <w:r>
-              <w:rPr>
-                <w:rFonts w:ascii="Menlo" w:hAnsi="Menlo" w:cs="Menlo"/>
-                <w:b w:val="0"/>
-                <w:i w:val="0"/>
-                <w:sz w:val="21"/>
-              </w:rPr>
-              <w:t>Algoritmo HolaMundo</w:t>
-              <w:br/>
-              <w:t xml:space="preserve">    Escribir "Hola mundo";</w:t>
-              <w:br/>
-              <w:t>FinAlgoritmo</w:t>
-            </w:r>
-          </w:p>
-        </w:tc>
-      </w:tr>
-    </w:tbl>
-    <w:p>
-      <w:r>
-        <w:rPr>
-          <w:rFonts w:ascii="Calibri" w:hAnsi="Calibri" w:cs="Calibri"/>
-          <w:b w:val="0"/>
-          <w:i w:val="0"/>
-          <w:sz w:val="24"/>
-        </w:rPr>
-        <w:t>La consola muestra Hola mundo y no pide ningún dato. En Área de un triángulo, en cambio, te detienes dos veces: primero escribes 4 y pulsas Enviar, después 3 y Enviar, y la consola escribe que el área es 6.</w:t>
+        <w:t>Ejemplo. Para la raíz de un área se escribe Raíz(area). Raíz devuelve un real. Longitud cuenta los símbolos de una cadena. Aleatorio() da un real entre 0 y 1. Aleatorio(1, 6) da un entero de ese intervalo, incluidos los extremos.</w:t>
       </w:r>
     </w:p>
     <w:p>
@@ -1110,18 +657,20 @@
           <w:color w:val="3D2A5C"/>
           <w:sz w:val="44"/>
         </w:rPr>
-        <w:t>11. Traducir</w:t>
+        <w:t>6. Operadores</w:t>
       </w:r>
     </w:p>
     <w:p>
+      <w:pPr/>
       <w:r>
         <w:rPr>
           <w:rFonts w:ascii="Calibri" w:hAnsi="Calibri" w:cs="Calibri"/>
           <w:b w:val="0"/>
           <w:i w:val="0"/>
+          <w:color w:val="1E293B"/>
           <w:sz w:val="24"/>
         </w:rPr>
-        <w:t>Traducir genera el mismo algoritmo en Python, JavaScript, TypeScript, Java, C, C++ y C#. Cada lenguaje es una pestaña. Puedes copiar el texto o descargarlo, y ampliar la ventana. No ejecuta el algoritmo y no guarda el programa generado. Usa el mismo análisis que Validar: si hay errores, no hay pestañas de código.</w:t>
+        <w:t>Operadores abre la lista de signos que se pueden usar. No cambia el código. Escape o un clic fuera cierra el panel.</w:t>
       </w:r>
     </w:p>
     <w:p>
@@ -1131,8 +680,8 @@
       <w:r>
         <w:drawing>
           <wp:inline xmlns:a="http://schemas.openxmlformats.org/drawingml/2006/main" xmlns:pic="http://schemas.openxmlformats.org/drawingml/2006/picture">
-            <wp:extent cx="5852160" cy="3657600"/>
-            <wp:docPr id="8" name="Picture 8"/>
+            <wp:extent cx="5852160" cy="4403799"/>
+            <wp:docPr id="6" name="Picture 6"/>
             <wp:cNvGraphicFramePr>
               <a:graphicFrameLocks noChangeAspect="1"/>
             </wp:cNvGraphicFramePr>
@@ -1140,11 +689,11 @@
               <a:graphicData uri="http://schemas.openxmlformats.org/drawingml/2006/picture">
                 <pic:pic>
                   <pic:nvPicPr>
-                    <pic:cNvPr id="0" name="09-traducir.png"/>
+                    <pic:cNvPr id="0" name="18-operadores.png"/>
                     <pic:cNvPicPr/>
                   </pic:nvPicPr>
                   <pic:blipFill>
-                    <a:blip r:embed="rId16"/>
+                    <a:blip r:embed="rId14"/>
                     <a:stretch>
                       <a:fillRect/>
                     </a:stretch>
@@ -1152,7 +701,7 @@
                   <pic:spPr>
                     <a:xfrm>
                       <a:off x="0" y="0"/>
-                      <a:ext cx="5852160" cy="3657600"/>
+                      <a:ext cx="5852160" cy="4403799"/>
                     </a:xfrm>
                     <a:prstGeom prst="rect"/>
                   </pic:spPr>
@@ -1175,29 +724,33 @@
           <w:color w:val="475569"/>
           <w:sz w:val="20"/>
         </w:rPr>
-        <w:t>Figura 8. Traducción de Hola mundo, con la pestaña Python.</w:t>
+        <w:t>Figura 6. Operadores, del más fuerte al más débil.</w:t>
       </w:r>
     </w:p>
     <w:p>
+      <w:pPr/>
       <w:r>
         <w:rPr>
           <w:rFonts w:ascii="Calibri" w:hAnsi="Calibri" w:cs="Calibri"/>
           <w:b w:val="0"/>
           <w:i w:val="0"/>
+          <w:color w:val="1E293B"/>
           <w:sz w:val="24"/>
         </w:rPr>
-        <w:t>El botón puede faltar o estar apagado. Falta si el nivel no incluye traducir. Está apagado si un docente lo desactivó para tu comunidad o para ti, aunque el nivel sí lo tenga. En ese caso no se genera código.</w:t>
+        <w:t>En una expresión, ^ liga más fuerte, luego * / DIV MOD, luego + y -, luego las comparaciones, y al final NO, Y y O. &lt;- asigna y no va dentro de una expresión. = compara y no asigna. &lt;&gt; y != son lo mismo. % y MOD son lo mismo. / da un real. DIV y MOD truncan hacia cero.</w:t>
       </w:r>
     </w:p>
     <w:p>
+      <w:pPr/>
       <w:r>
         <w:rPr>
           <w:rFonts w:ascii="Calibri" w:hAnsi="Calibri" w:cs="Calibri"/>
           <w:b w:val="0"/>
           <w:i w:val="0"/>
+          <w:color w:val="1E293B"/>
           <w:sz w:val="24"/>
         </w:rPr>
-        <w:t>Ejemplo. Con Hola mundo pulsas Traducir y abres Python. Verás un print con el mismo texto. Copiar deja ese programa en el portapapeles. El intérprete de Aulivana-FCDdesign sigue siendo el que ejecuta tu pseudocódigo.</w:t>
+        <w:t>Ejemplo. En el área del triángulo, (base * altura) / 2 multiplica antes de dividir porque los paréntesis agrupan y * liga más que el orden en que se lee.</w:t>
       </w:r>
     </w:p>
     <w:p>
@@ -1212,127 +765,20 @@
           <w:color w:val="3D2A5C"/>
           <w:sz w:val="44"/>
         </w:rPr>
-        <w:t>12. Depurar</w:t>
+        <w:t>7. Manuales</w:t>
       </w:r>
     </w:p>
     <w:p>
+      <w:pPr/>
       <w:r>
         <w:rPr>
           <w:rFonts w:ascii="Calibri" w:hAnsi="Calibri" w:cs="Calibri"/>
           <w:b w:val="0"/>
           <w:i w:val="0"/>
+          <w:color w:val="1E293B"/>
           <w:sz w:val="24"/>
         </w:rPr>
-        <w:t>Depurar empieza el recorrido y se detiene para que avances a mano. La línea actual se marca. El panel Depurador muestra el nombre del algoritmo, la línea, la pila de llamadas y las variables. Un clic en el margen del editor pone o quita un punto rojo: la ejecución se detiene en esa línea.</w:t>
-      </w:r>
-    </w:p>
-    <w:p>
-      <w:r>
-        <w:rPr>
-          <w:rFonts w:ascii="Calibri" w:hAnsi="Calibri" w:cs="Calibri"/>
-          <w:b w:val="0"/>
-          <w:i w:val="0"/>
-          <w:sz w:val="24"/>
-        </w:rPr>
-        <w:t>Los botones, mientras está en pausa, hacen esto:</w:t>
-      </w:r>
-    </w:p>
-    <w:p>
-      <w:pPr>
-        <w:pStyle w:val="ListBullet"/>
-      </w:pPr>
-      <w:r>
-        <w:rPr>
-          <w:rFonts w:ascii="Calibri" w:hAnsi="Calibri" w:cs="Calibri"/>
-          <w:b w:val="0"/>
-          <w:i w:val="0"/>
-          <w:sz w:val="24"/>
-        </w:rPr>
-        <w:t>Paso avanza a la siguiente instrucción del mismo nivel.</w:t>
-      </w:r>
-    </w:p>
-    <w:p>
-      <w:pPr>
-        <w:pStyle w:val="ListBullet"/>
-      </w:pPr>
-      <w:r>
-        <w:rPr>
-          <w:rFonts w:ascii="Calibri" w:hAnsi="Calibri" w:cs="Calibri"/>
-          <w:b w:val="0"/>
-          <w:i w:val="0"/>
-          <w:sz w:val="24"/>
-        </w:rPr>
-        <w:t>Entrar se mete dentro de una función o un procedimiento.</w:t>
-      </w:r>
-    </w:p>
-    <w:p>
-      <w:pPr>
-        <w:pStyle w:val="ListBullet"/>
-      </w:pPr>
-      <w:r>
-        <w:rPr>
-          <w:rFonts w:ascii="Calibri" w:hAnsi="Calibri" w:cs="Calibri"/>
-          <w:b w:val="0"/>
-          <w:i w:val="0"/>
-          <w:sz w:val="24"/>
-        </w:rPr>
-        <w:t>Salir termina la función actual y vuelve a quien la llamó.</w:t>
-      </w:r>
-    </w:p>
-    <w:p>
-      <w:pPr>
-        <w:pStyle w:val="ListBullet"/>
-      </w:pPr>
-      <w:r>
-        <w:rPr>
-          <w:rFonts w:ascii="Calibri" w:hAnsi="Calibri" w:cs="Calibri"/>
-          <w:b w:val="0"/>
-          <w:i w:val="0"/>
-          <w:sz w:val="24"/>
-        </w:rPr>
-        <w:t>Continuar sigue hasta el siguiente punto rojo, una espera de lectura o el final.</w:t>
-      </w:r>
-    </w:p>
-    <w:p>
-      <w:pPr>
-        <w:pStyle w:val="ListBullet"/>
-      </w:pPr>
-      <w:r>
-        <w:rPr>
-          <w:rFonts w:ascii="Calibri" w:hAnsi="Calibri" w:cs="Calibri"/>
-          <w:b w:val="0"/>
-          <w:i w:val="0"/>
-          <w:sz w:val="24"/>
-        </w:rPr>
-        <w:t>Pausar frena una ejecución que iba sola.</w:t>
-      </w:r>
-    </w:p>
-    <w:p>
-      <w:pPr>
-        <w:pStyle w:val="ListBullet"/>
-      </w:pPr>
-      <w:r>
-        <w:rPr>
-          <w:rFonts w:ascii="Calibri" w:hAnsi="Calibri" w:cs="Calibri"/>
-          <w:b w:val="0"/>
-          <w:i w:val="0"/>
-          <w:sz w:val="24"/>
-        </w:rPr>
-        <w:t>Detener la corta.</w:t>
-      </w:r>
-    </w:p>
-    <w:p>
-      <w:pPr>
-        <w:pStyle w:val="ListBullet"/>
-      </w:pPr>
-      <w:r>
-        <w:rPr>
-          <w:rFonts w:ascii="Calibri" w:hAnsi="Calibri" w:cs="Calibri"/>
-          <w:b w:val="0"/>
-          <w:i w:val="0"/>
-          <w:sz w:val="24"/>
-        </w:rPr>
-        <w:t>Reiniciar vuelve al principio del mismo recorrido.</w:t>
+        <w:t>Manuales lista el manual del lenguaje y este manual. Ver abre el PDF en la misma ventana. Descargar PDF lo guarda. En el navegador es una descarga normal. En la aplicación de escritorio se abre el cuadro para elegir la carpeta.</w:t>
       </w:r>
     </w:p>
     <w:p>
@@ -1342,8 +788,8 @@
       <w:r>
         <w:drawing>
           <wp:inline xmlns:a="http://schemas.openxmlformats.org/drawingml/2006/main" xmlns:pic="http://schemas.openxmlformats.org/drawingml/2006/picture">
-            <wp:extent cx="5852160" cy="3657600"/>
-            <wp:docPr id="9" name="Picture 9"/>
+            <wp:extent cx="5852160" cy="4403799"/>
+            <wp:docPr id="7" name="Picture 7"/>
             <wp:cNvGraphicFramePr>
               <a:graphicFrameLocks noChangeAspect="1"/>
             </wp:cNvGraphicFramePr>
@@ -1351,11 +797,11 @@
               <a:graphicData uri="http://schemas.openxmlformats.org/drawingml/2006/picture">
                 <pic:pic>
                   <pic:nvPicPr>
-                    <pic:cNvPr id="0" name="10-depurar.png"/>
+                    <pic:cNvPr id="0" name="19-manuales.png"/>
                     <pic:cNvPicPr/>
                   </pic:nvPicPr>
                   <pic:blipFill>
-                    <a:blip r:embed="rId17"/>
+                    <a:blip r:embed="rId15"/>
                     <a:stretch>
                       <a:fillRect/>
                     </a:stretch>
@@ -1363,7 +809,7 @@
                   <pic:spPr>
                     <a:xfrm>
                       <a:off x="0" y="0"/>
-                      <a:ext cx="5852160" cy="3657600"/>
+                      <a:ext cx="5852160" cy="4403799"/>
                     </a:xfrm>
                     <a:prstGeom prst="rect"/>
                   </pic:spPr>
@@ -1386,92 +832,7 @@
           <w:color w:val="475569"/>
           <w:sz w:val="20"/>
         </w:rPr>
-        <w:t>Figura 9. Hola mundo en pausa, en la línea del Escribir.</w:t>
-      </w:r>
-    </w:p>
-    <w:p>
-      <w:r>
-        <w:rPr>
-          <w:rFonts w:ascii="Calibri" w:hAnsi="Calibri" w:cs="Calibri"/>
-          <w:b w:val="0"/>
-          <w:i w:val="0"/>
-          <w:sz w:val="24"/>
-        </w:rPr>
-        <w:t>Ejemplo. Pulsas Depurar en Hola mundo. La pausa cae en Escribir. La pila dice HolaMundo y la línea 2, y todavía no hay variables. Paso ejecuta esa línea: la consola escribe Hola mundo y el recorrido termina. En Factorial recursivo, Entrar baja a la llamada y Salir regresa. Ahí sí verás la variable en el panel.</w:t>
-      </w:r>
-    </w:p>
-    <w:p>
-      <w:pPr>
-        <w:pStyle w:val="Heading1"/>
-      </w:pPr>
-      <w:r>
-        <w:rPr>
-          <w:rFonts w:ascii="Calibri" w:hAnsi="Calibri" w:cs="Calibri"/>
-          <w:b/>
-          <w:i w:val="0"/>
-          <w:color w:val="3D2A5C"/>
-          <w:sz w:val="44"/>
-        </w:rPr>
-        <w:t>13. Diagrama</w:t>
-      </w:r>
-    </w:p>
-    <w:p>
-      <w:r>
-        <w:rPr>
-          <w:rFonts w:ascii="Calibri" w:hAnsi="Calibri" w:cs="Calibri"/>
-          <w:b w:val="0"/>
-          <w:i w:val="0"/>
-          <w:sz w:val="24"/>
-        </w:rPr>
-        <w:t>El panel Diagrama dibuja el flujo del algoritmo guardado. Inicio y fin son óvalos, un proceso es un rectángulo, la entrada y la salida tienen su forma, y una decisión se abre en ramas. Si el texto todavía no se puede dibujar, el panel lo dice.</w:t>
-      </w:r>
-    </w:p>
-    <w:p>
-      <w:r>
-        <w:rPr>
-          <w:rFonts w:ascii="Calibri" w:hAnsi="Calibri" w:cs="Calibri"/>
-          <w:b w:val="0"/>
-          <w:i w:val="0"/>
-          <w:sz w:val="24"/>
-        </w:rPr>
-        <w:t>Los botones del panel exportan el dibujo: SVG, PNG, PDF e Imprimir. El menos lo oculta y el más lo vuelve a mostrar. Las lupas acercan, alejan y encajan el dibujo.</w:t>
-      </w:r>
-    </w:p>
-    <w:p>
-      <w:r>
-        <w:rPr>
-          <w:rFonts w:ascii="Calibri" w:hAnsi="Calibri" w:cs="Calibri"/>
-          <w:b w:val="0"/>
-          <w:i w:val="0"/>
-          <w:sz w:val="24"/>
-        </w:rPr>
-        <w:t>Ejemplo. Con Área de un triángulo guardado, el diagrama de la figura 6 muestra la definición, las dos lecturas, el cálculo del área y la escritura del resultado. PNG descarga esa imagen. Si cambias el texto y no coincide con lo último guardado, el diagrama sigue al fuente guardado hasta que la versión quede al día.</w:t>
-      </w:r>
-    </w:p>
-    <w:p>
-      <w:pPr>
-        <w:pStyle w:val="Heading1"/>
-      </w:pPr>
-      <w:r>
-        <w:rPr>
-          <w:rFonts w:ascii="Calibri" w:hAnsi="Calibri" w:cs="Calibri"/>
-          <w:b/>
-          <w:i w:val="0"/>
-          <w:color w:val="3D2A5C"/>
-          <w:sz w:val="44"/>
-        </w:rPr>
-        <w:t>14. Funciones</w:t>
-      </w:r>
-    </w:p>
-    <w:p>
-      <w:r>
-        <w:rPr>
-          <w:rFonts w:ascii="Calibri" w:hAnsi="Calibri" w:cs="Calibri"/>
-          <w:b w:val="0"/>
-          <w:i w:val="0"/>
-          <w:sz w:val="24"/>
-        </w:rPr>
-        <w:t>Funciones abre la lista de operaciones incluidas. No son algoritmos tuyos: se usan dentro de una expresión. Cada fila muestra cómo se escribe y qué devuelve. Cerrar el menú es volver a pulsar Funciones o abrir Configuración.</w:t>
+        <w:t>Figura 7. Los dos manuales del alumno.</w:t>
       </w:r>
     </w:p>
     <w:p>
@@ -1481,8 +842,8 @@
       <w:r>
         <w:drawing>
           <wp:inline xmlns:a="http://schemas.openxmlformats.org/drawingml/2006/main" xmlns:pic="http://schemas.openxmlformats.org/drawingml/2006/picture">
-            <wp:extent cx="5852160" cy="3657600"/>
-            <wp:docPr id="10" name="Picture 10"/>
+            <wp:extent cx="5852160" cy="4403799"/>
+            <wp:docPr id="8" name="Picture 8"/>
             <wp:cNvGraphicFramePr>
               <a:graphicFrameLocks noChangeAspect="1"/>
             </wp:cNvGraphicFramePr>
@@ -1490,11 +851,11 @@
               <a:graphicData uri="http://schemas.openxmlformats.org/drawingml/2006/picture">
                 <pic:pic>
                   <pic:nvPicPr>
-                    <pic:cNvPr id="0" name="05-funciones.png"/>
+                    <pic:cNvPr id="0" name="22-ver-pdf.png"/>
                     <pic:cNvPicPr/>
                   </pic:nvPicPr>
                   <pic:blipFill>
-                    <a:blip r:embed="rId18"/>
+                    <a:blip r:embed="rId16"/>
                     <a:stretch>
                       <a:fillRect/>
                     </a:stretch>
@@ -1502,7 +863,7 @@
                   <pic:spPr>
                     <a:xfrm>
                       <a:off x="0" y="0"/>
-                      <a:ext cx="5852160" cy="3657600"/>
+                      <a:ext cx="5852160" cy="4403799"/>
                     </a:xfrm>
                     <a:prstGeom prst="rect"/>
                   </pic:spPr>
@@ -1525,18 +886,20 @@
           <w:color w:val="475569"/>
           <w:sz w:val="20"/>
         </w:rPr>
-        <w:t>Figura 10. Menú Funciones, con las operaciones incluidas.</w:t>
+        <w:t>Figura 8. Ver abre el PDF del manual del lenguaje.</w:t>
       </w:r>
     </w:p>
     <w:p>
+      <w:pPr/>
       <w:r>
         <w:rPr>
           <w:rFonts w:ascii="Calibri" w:hAnsi="Calibri" w:cs="Calibri"/>
           <w:b w:val="0"/>
           <w:i w:val="0"/>
+          <w:color w:val="1E293B"/>
           <w:sz w:val="24"/>
         </w:rPr>
-        <w:t>Ejemplo. Quieres el valor absoluto de un número negativo. En el editor escribes resultado &lt;- Abs(-3); y ese resultado vale 3. Otras de la misma lista: Raíz(9) vale 3, Longitud("Ana") vale 3, y Aleatorio(1, 6) devuelve un entero entre 1 y 6, incluidos los extremos.</w:t>
+        <w:t>Ejemplo. Ver en Manual del lenguaje muestra el PDF. Cerrar vuelve al algoritmo. Descargar PDF guarda lenguaje.pdf.</w:t>
       </w:r>
     </w:p>
     <w:p>
@@ -1551,88 +914,20 @@
           <w:color w:val="3D2A5C"/>
           <w:sz w:val="44"/>
         </w:rPr>
-        <w:t>15. Configuración</w:t>
+        <w:t>8. Configuración</w:t>
       </w:r>
     </w:p>
     <w:p>
+      <w:pPr/>
       <w:r>
         <w:rPr>
           <w:rFonts w:ascii="Calibri" w:hAnsi="Calibri" w:cs="Calibri"/>
           <w:b w:val="0"/>
           <w:i w:val="0"/>
+          <w:color w:val="1E293B"/>
           <w:sz w:val="24"/>
         </w:rPr>
-        <w:t>Configuración se guarda en la cuenta. El código que ya escribiste no se reescribe al cambiar una opción. Las opciones son:</w:t>
-      </w:r>
-    </w:p>
-    <w:p>
-      <w:pPr>
-        <w:pStyle w:val="ListBullet"/>
-      </w:pPr>
-      <w:r>
-        <w:rPr>
-          <w:rFonts w:ascii="Calibri" w:hAnsi="Calibri" w:cs="Calibri"/>
-          <w:b w:val="0"/>
-          <w:i w:val="0"/>
-          <w:sz w:val="24"/>
-        </w:rPr>
-        <w:t>Idioma: Español o English. Cambia la interfaz y la forma de las palabras reservadas.</w:t>
-      </w:r>
-    </w:p>
-    <w:p>
-      <w:pPr>
-        <w:pStyle w:val="ListBullet"/>
-      </w:pPr>
-      <w:r>
-        <w:rPr>
-          <w:rFonts w:ascii="Calibri" w:hAnsi="Calibri" w:cs="Calibri"/>
-          <w:b w:val="0"/>
-          <w:i w:val="0"/>
-          <w:sz w:val="24"/>
-        </w:rPr>
-        <w:t>Cuerpo: 14, 16, 18, 20 o 22. Es el tamaño de la letra del editor.</w:t>
-      </w:r>
-    </w:p>
-    <w:p>
-      <w:pPr>
-        <w:pStyle w:val="ListBullet"/>
-      </w:pPr>
-      <w:r>
-        <w:rPr>
-          <w:rFonts w:ascii="Calibri" w:hAnsi="Calibri" w:cs="Calibri"/>
-          <w:b w:val="0"/>
-          <w:i w:val="0"/>
-          <w:sz w:val="24"/>
-        </w:rPr>
-        <w:t>Modo: Claro u Oscuro.</w:t>
-      </w:r>
-    </w:p>
-    <w:p>
-      <w:pPr>
-        <w:pStyle w:val="ListBullet"/>
-      </w:pPr>
-      <w:r>
-        <w:rPr>
-          <w:rFonts w:ascii="Calibri" w:hAnsi="Calibri" w:cs="Calibri"/>
-          <w:b w:val="0"/>
-          <w:i w:val="0"/>
-          <w:sz w:val="24"/>
-        </w:rPr>
-        <w:t>Punto y coma: Obligatorio u Opcional. Obligatorio exige el punto y coma al final de la instrucción.</w:t>
-      </w:r>
-    </w:p>
-    <w:p>
-      <w:pPr>
-        <w:pStyle w:val="ListBullet"/>
-      </w:pPr>
-      <w:r>
-        <w:rPr>
-          <w:rFonts w:ascii="Calibri" w:hAnsi="Calibri" w:cs="Calibri"/>
-          <w:b w:val="0"/>
-          <w:i w:val="0"/>
-          <w:sz w:val="24"/>
-        </w:rPr>
-        <w:t>Índice de arreglos: Empieza en 1 o Empieza en 0. Define cuál es la primera casilla.</w:t>
+        <w:t>Configuración guarda el idioma, el tamaño del texto, el modo claro u oscuro, si el punto y coma es obligatorio y si los arreglos empiezan en 1 o en 0. El cambio queda en la cuenta. El código ya escrito no se reescribe.</w:t>
       </w:r>
     </w:p>
     <w:p>
@@ -1642,8 +937,8 @@
       <w:r>
         <w:drawing>
           <wp:inline xmlns:a="http://schemas.openxmlformats.org/drawingml/2006/main" xmlns:pic="http://schemas.openxmlformats.org/drawingml/2006/picture">
-            <wp:extent cx="5852160" cy="3657600"/>
-            <wp:docPr id="11" name="Picture 11"/>
+            <wp:extent cx="5852160" cy="4403799"/>
+            <wp:docPr id="9" name="Picture 9"/>
             <wp:cNvGraphicFramePr>
               <a:graphicFrameLocks noChangeAspect="1"/>
             </wp:cNvGraphicFramePr>
@@ -1655,7 +950,7 @@
                     <pic:cNvPicPr/>
                   </pic:nvPicPr>
                   <pic:blipFill>
-                    <a:blip r:embed="rId19"/>
+                    <a:blip r:embed="rId17"/>
                     <a:stretch>
                       <a:fillRect/>
                     </a:stretch>
@@ -1663,7 +958,7 @@
                   <pic:spPr>
                     <a:xfrm>
                       <a:off x="0" y="0"/>
-                      <a:ext cx="5852160" cy="3657600"/>
+                      <a:ext cx="5852160" cy="4403799"/>
                     </a:xfrm>
                     <a:prstGeom prst="rect"/>
                   </pic:spPr>
@@ -1686,18 +981,20 @@
           <w:color w:val="475569"/>
           <w:sz w:val="20"/>
         </w:rPr>
-        <w:t>Figura 11. Menú Configuración.</w:t>
+        <w:t>Figura 9. Idioma, cuerpo, modo, punto y coma e índice.</w:t>
       </w:r>
     </w:p>
     <w:p>
+      <w:pPr/>
       <w:r>
         <w:rPr>
           <w:rFonts w:ascii="Calibri" w:hAnsi="Calibri" w:cs="Calibri"/>
           <w:b w:val="0"/>
           <w:i w:val="0"/>
+          <w:color w:val="1E293B"/>
           <w:sz w:val="24"/>
         </w:rPr>
-        <w:t>Ejemplo. Dejas el índice en Empieza en 1. En un arreglo de tres notas, la primera se llama notas[1] y la última notas[3]. Si un compañero usa Empieza en 0, su primera casilla es la 0. Los dos pueden ser correctos: cada algoritmo obedece la opción de su cuenta.</w:t>
+        <w:t>Ejemplo. Ana deja Español, cuerpo 16, modo claro, punto y coma obligatorio e índice que empieza en 1. Un arreglo de tres casillas se usa entonces como notas[1], notas[2] y notas[3].</w:t>
       </w:r>
     </w:p>
     <w:p>
@@ -1712,29 +1009,20 @@
           <w:color w:val="3D2A5C"/>
           <w:sz w:val="44"/>
         </w:rPr>
-        <w:t>16. Laboratorio: las rutas</w:t>
+        <w:t>9. Perfil</w:t>
       </w:r>
     </w:p>
     <w:p>
+      <w:pPr/>
       <w:r>
         <w:rPr>
           <w:rFonts w:ascii="Calibri" w:hAnsi="Calibri" w:cs="Calibri"/>
           <w:b w:val="0"/>
           <w:i w:val="0"/>
+          <w:color w:val="1E293B"/>
           <w:sz w:val="24"/>
         </w:rPr>
-        <w:t>Laboratorio cambia la barra. Ruta lista las rutas que tienes asignadas. Práctica libre es el lienzo de bloques. Actualizar vuelve a cargar la ruta o la práctica. Volver al editor regresa al pseudocódigo.</w:t>
-      </w:r>
-    </w:p>
-    <w:p>
-      <w:r>
-        <w:rPr>
-          <w:rFonts w:ascii="Calibri" w:hAnsi="Calibri" w:cs="Calibri"/>
-          <w:b w:val="0"/>
-          <w:i w:val="0"/>
-          <w:sz w:val="24"/>
-        </w:rPr>
-        <w:t>Cada ruta muestra cuántos retos tiene, cuántos completaste y el porcentaje. Ver retos abre la lista. Volver a las rutas regresa al conjunto. Un reto ligado se abre cuando el anterior está hecho: el primero dice Abrir y los demás Bloqueado. También puede haber retos con fecha de apertura o de cierre.</w:t>
+        <w:t>El recuadro del nombre abre Personalizar perfil. Ahí se cambia el nombre, la foto y la contraseña. La foto es JPG o PNG. Para cambiar la contraseña hace falta escribir la actual y repetir la nueva. El perfil de estudiante no se cambia desde aquí.</w:t>
       </w:r>
     </w:p>
     <w:p>
@@ -1744,8 +1032,8 @@
       <w:r>
         <w:drawing>
           <wp:inline xmlns:a="http://schemas.openxmlformats.org/drawingml/2006/main" xmlns:pic="http://schemas.openxmlformats.org/drawingml/2006/picture">
-            <wp:extent cx="5852160" cy="3657600"/>
-            <wp:docPr id="12" name="Picture 12"/>
+            <wp:extent cx="5852160" cy="4403799"/>
+            <wp:docPr id="10" name="Picture 10"/>
             <wp:cNvGraphicFramePr>
               <a:graphicFrameLocks noChangeAspect="1"/>
             </wp:cNvGraphicFramePr>
@@ -1753,11 +1041,11 @@
               <a:graphicData uri="http://schemas.openxmlformats.org/drawingml/2006/picture">
                 <pic:pic>
                   <pic:nvPicPr>
-                    <pic:cNvPr id="0" name="11-rutas.png"/>
+                    <pic:cNvPr id="0" name="07-perfil.png"/>
                     <pic:cNvPicPr/>
                   </pic:nvPicPr>
                   <pic:blipFill>
-                    <a:blip r:embed="rId20"/>
+                    <a:blip r:embed="rId18"/>
                     <a:stretch>
                       <a:fillRect/>
                     </a:stretch>
@@ -1765,7 +1053,7 @@
                   <pic:spPr>
                     <a:xfrm>
                       <a:off x="0" y="0"/>
-                      <a:ext cx="5852160" cy="3657600"/>
+                      <a:ext cx="5852160" cy="4403799"/>
                     </a:xfrm>
                     <a:prstGeom prst="rect"/>
                   </pic:spPr>
@@ -1788,7 +1076,48 @@
           <w:color w:val="475569"/>
           <w:sz w:val="20"/>
         </w:rPr>
-        <w:t>Figura 12. Rutas que ve el estudiante, con su avance.</w:t>
+        <w:t>Figura 10. Nombre, foto y contraseña de Ana Ruiz.</w:t>
+      </w:r>
+    </w:p>
+    <w:p>
+      <w:pPr/>
+      <w:r>
+        <w:rPr>
+          <w:rFonts w:ascii="Calibri" w:hAnsi="Calibri" w:cs="Calibri"/>
+          <w:b w:val="0"/>
+          <w:i w:val="0"/>
+          <w:color w:val="1E293B"/>
+          <w:sz w:val="24"/>
+        </w:rPr>
+        <w:t>Ejemplo. Ana puede cambiar el nombre visible a Ana Ruiz y dejar las tres contraseñas vacías si no quiere cambiarla. Guardar actualiza la ficha. Cancelar cierra sin guardar.</w:t>
+      </w:r>
+    </w:p>
+    <w:p>
+      <w:pPr>
+        <w:pStyle w:val="Heading1"/>
+      </w:pPr>
+      <w:r>
+        <w:rPr>
+          <w:rFonts w:ascii="Calibri" w:hAnsi="Calibri" w:cs="Calibri"/>
+          <w:b/>
+          <w:i w:val="0"/>
+          <w:color w:val="3D2A5C"/>
+          <w:sz w:val="44"/>
+        </w:rPr>
+        <w:t>10. Validar y ejecutar</w:t>
+      </w:r>
+    </w:p>
+    <w:p>
+      <w:pPr/>
+      <w:r>
+        <w:rPr>
+          <w:rFonts w:ascii="Calibri" w:hAnsi="Calibri" w:cs="Calibri"/>
+          <w:b w:val="0"/>
+          <w:i w:val="0"/>
+          <w:color w:val="1E293B"/>
+          <w:sz w:val="24"/>
+        </w:rPr>
+        <w:t>Validar revisa el texto y marca la línea y la columna si hay un error. No lo ejecuta. Ejecutar lo recorre. Si hay un Leer, la consola pide el dato. La salida aparece debajo del editor.</w:t>
       </w:r>
     </w:p>
     <w:p>
@@ -1798,8 +1127,8 @@
       <w:r>
         <w:drawing>
           <wp:inline xmlns:a="http://schemas.openxmlformats.org/drawingml/2006/main" xmlns:pic="http://schemas.openxmlformats.org/drawingml/2006/picture">
-            <wp:extent cx="5852160" cy="3657600"/>
-            <wp:docPr id="13" name="Picture 13"/>
+            <wp:extent cx="5852160" cy="4403799"/>
+            <wp:docPr id="11" name="Picture 11"/>
             <wp:cNvGraphicFramePr>
               <a:graphicFrameLocks noChangeAspect="1"/>
             </wp:cNvGraphicFramePr>
@@ -1807,11 +1136,11 @@
               <a:graphicData uri="http://schemas.openxmlformats.org/drawingml/2006/picture">
                 <pic:pic>
                   <pic:nvPicPr>
-                    <pic:cNvPr id="0" name="12-ruta-fundamentos.png"/>
+                    <pic:cNvPr id="0" name="08-ejecutar.png"/>
                     <pic:cNvPicPr/>
                   </pic:nvPicPr>
                   <pic:blipFill>
-                    <a:blip r:embed="rId21"/>
+                    <a:blip r:embed="rId19"/>
                     <a:stretch>
                       <a:fillRect/>
                     </a:stretch>
@@ -1819,7 +1148,7 @@
                   <pic:spPr>
                     <a:xfrm>
                       <a:off x="0" y="0"/>
-                      <a:ext cx="5852160" cy="3657600"/>
+                      <a:ext cx="5852160" cy="4403799"/>
                     </a:xfrm>
                     <a:prstGeom prst="rect"/>
                   </pic:spPr>
@@ -1842,18 +1171,77 @@
           <w:color w:val="475569"/>
           <w:sz w:val="20"/>
         </w:rPr>
-        <w:t>Figura 13. Ruta Fundamentos: el reto 1 está abierto y el 2 sigue bloqueado.</w:t>
+        <w:t>Figura 11. Hola mundo ya ejecutado.</w:t>
       </w:r>
     </w:p>
     <w:p>
+      <w:pPr/>
       <w:r>
         <w:rPr>
           <w:rFonts w:ascii="Calibri" w:hAnsi="Calibri" w:cs="Calibri"/>
           <w:b w:val="0"/>
           <w:i w:val="0"/>
+          <w:color w:val="1E293B"/>
           <w:sz w:val="24"/>
         </w:rPr>
-        <w:t>Ejemplo. Entras a Fundamentos. El reto 1, Qué entra y qué sale, está abierto y vale 10 puntos, con 3 minutos. Pulsas Abrir. El reto 2, Orden para mostrar un precio, sigue bloqueado hasta que completes el 1. Al terminarlo, tus puntos de la barra suben y el siguiente se puede abrir.</w:t>
+        <w:t>Ejemplo. En Ejemplos, Hola mundo es:</w:t>
+      </w:r>
+    </w:p>
+    <w:tbl>
+      <w:tblPr>
+        <w:tblW w:type="auto" w:w="0"/>
+        <w:tblLook w:firstColumn="1" w:firstRow="1" w:lastColumn="0" w:lastRow="0" w:noHBand="0" w:noVBand="1" w:val="04A0"/>
+      </w:tblPr>
+      <w:tblGrid>
+        <w:gridCol w:w="9648"/>
+      </w:tblGrid>
+      <w:tr>
+        <w:tc>
+          <w:tcPr>
+            <w:tcW w:type="dxa" w:w="9648"/>
+            <w:shd w:val="clear" w:color="auto" w:fill="F7F4EC"/>
+            <w:tcW w:w="9866" w:type="dxa"/>
+          </w:tcPr>
+          <w:p>
+            <w:r>
+              <w:rPr>
+                <w:rFonts w:ascii="Menlo" w:hAnsi="Menlo" w:cs="Menlo"/>
+                <w:b w:val="0"/>
+                <w:i w:val="0"/>
+                <w:color w:val="1E293B"/>
+                <w:sz w:val="21"/>
+              </w:rPr>
+            </w:r>
+            <w:r>
+              <w:rPr>
+                <w:rFonts w:ascii="Menlo" w:hAnsi="Menlo" w:cs="Menlo"/>
+                <w:b w:val="0"/>
+                <w:i w:val="0"/>
+                <w:color w:val="1E293B"/>
+                <w:sz w:val="21"/>
+              </w:rPr>
+              <w:t>Algoritmo HolaMundo</w:t>
+              <w:br/>
+              <w:t xml:space="preserve">    Escribir "Hola mundo";</w:t>
+              <w:br/>
+              <w:t>FinAlgoritmo</w:t>
+            </w:r>
+          </w:p>
+        </w:tc>
+      </w:tr>
+    </w:tbl>
+    <w:p/>
+    <w:p>
+      <w:pPr/>
+      <w:r>
+        <w:rPr>
+          <w:rFonts w:ascii="Calibri" w:hAnsi="Calibri" w:cs="Calibri"/>
+          <w:b w:val="0"/>
+          <w:i w:val="0"/>
+          <w:color w:val="1E293B"/>
+          <w:sz w:val="24"/>
+        </w:rPr>
+        <w:t>Ejecutar escribe Hola mundo en la consola y termina. No pide datos.</w:t>
       </w:r>
     </w:p>
     <w:p>
@@ -1868,29 +1256,20 @@
           <w:color w:val="3D2A5C"/>
           <w:sz w:val="44"/>
         </w:rPr>
-        <w:t>17. Dentro de un reto</w:t>
+        <w:t>11. Traducir</w:t>
       </w:r>
     </w:p>
     <w:p>
+      <w:pPr/>
       <w:r>
         <w:rPr>
           <w:rFonts w:ascii="Calibri" w:hAnsi="Calibri" w:cs="Calibri"/>
           <w:b w:val="0"/>
           <w:i w:val="0"/>
+          <w:color w:val="1E293B"/>
           <w:sz w:val="24"/>
         </w:rPr>
-        <w:t>Un reto tiene tres momentos. Comprender: lees el enunciado y confirmas con Ya lo comprendo. Razonar: respondes según el tipo de actividad. Explicar: escribes por qué esa respuesta resuelve el enunciado. A la derecha, Mentor ofrece pistas. Pedir una pista gasta una de las disponibles. El reloj, si el reto tiene tiempo, corre arriba.</w:t>
-      </w:r>
-    </w:p>
-    <w:p>
-      <w:r>
-        <w:rPr>
-          <w:rFonts w:ascii="Calibri" w:hAnsi="Calibri" w:cs="Calibri"/>
-          <w:b w:val="0"/>
-          <w:i w:val="0"/>
-          <w:sz w:val="24"/>
-        </w:rPr>
-        <w:t>Volver a la ruta sale sin usar el editor de proyectos. El intento del laboratorio no es una versión de tus algoritmos.</w:t>
+        <w:t>Traducir genera el mismo algoritmo en otro lenguaje. Usa el mismo árbol que Validar. No ejecuta el algoritmo y no guarda el texto generado. Si el nivel no incluye la traducción, el botón no está. Si un docente apagó la traducción del grupo, la cuenta de alumno recibe que el docente la desactivó.</w:t>
       </w:r>
     </w:p>
     <w:p>
@@ -1900,8 +1279,8 @@
       <w:r>
         <w:drawing>
           <wp:inline xmlns:a="http://schemas.openxmlformats.org/drawingml/2006/main" xmlns:pic="http://schemas.openxmlformats.org/drawingml/2006/picture">
-            <wp:extent cx="5852160" cy="3657600"/>
-            <wp:docPr id="14" name="Picture 14"/>
+            <wp:extent cx="5852160" cy="4403799"/>
+            <wp:docPr id="12" name="Picture 12"/>
             <wp:cNvGraphicFramePr>
               <a:graphicFrameLocks noChangeAspect="1"/>
             </wp:cNvGraphicFramePr>
@@ -1909,11 +1288,11 @@
               <a:graphicData uri="http://schemas.openxmlformats.org/drawingml/2006/picture">
                 <pic:pic>
                   <pic:nvPicPr>
-                    <pic:cNvPr id="0" name="13-reto.png"/>
+                    <pic:cNvPr id="0" name="09-traducir.png"/>
                     <pic:cNvPicPr/>
                   </pic:nvPicPr>
                   <pic:blipFill>
-                    <a:blip r:embed="rId22"/>
+                    <a:blip r:embed="rId20"/>
                     <a:stretch>
                       <a:fillRect/>
                     </a:stretch>
@@ -1921,7 +1300,7 @@
                   <pic:spPr>
                     <a:xfrm>
                       <a:off x="0" y="0"/>
-                      <a:ext cx="5852160" cy="3657600"/>
+                      <a:ext cx="5852160" cy="4403799"/>
                     </a:xfrm>
                     <a:prstGeom prst="rect"/>
                   </pic:spPr>
@@ -1944,7 +1323,48 @@
           <w:color w:val="475569"/>
           <w:sz w:val="20"/>
         </w:rPr>
-        <w:t>Figura 14. Momento Comprender, antes de responder.</w:t>
+        <w:t>Figura 12. Traducción de Hola mundo. Se pide al momento y no se guarda.</w:t>
+      </w:r>
+    </w:p>
+    <w:p>
+      <w:pPr/>
+      <w:r>
+        <w:rPr>
+          <w:rFonts w:ascii="Calibri" w:hAnsi="Calibri" w:cs="Calibri"/>
+          <w:b w:val="0"/>
+          <w:i w:val="0"/>
+          <w:color w:val="1E293B"/>
+          <w:sz w:val="24"/>
+        </w:rPr>
+        <w:t>Ejemplo. Traducir Hola mundo muestra el programa equivalente. Ampliar lo agranda. Cerrar vuelve al editor. El pseudocódigo de Hola mundo sigue igual.</w:t>
+      </w:r>
+    </w:p>
+    <w:p>
+      <w:pPr>
+        <w:pStyle w:val="Heading1"/>
+      </w:pPr>
+      <w:r>
+        <w:rPr>
+          <w:rFonts w:ascii="Calibri" w:hAnsi="Calibri" w:cs="Calibri"/>
+          <w:b/>
+          <w:i w:val="0"/>
+          <w:color w:val="3D2A5C"/>
+          <w:sz w:val="44"/>
+        </w:rPr>
+        <w:t>12. Depurar</w:t>
+      </w:r>
+    </w:p>
+    <w:p>
+      <w:pPr/>
+      <w:r>
+        <w:rPr>
+          <w:rFonts w:ascii="Calibri" w:hAnsi="Calibri" w:cs="Calibri"/>
+          <w:b w:val="0"/>
+          <w:i w:val="0"/>
+          <w:color w:val="1E293B"/>
+          <w:sz w:val="24"/>
+        </w:rPr>
+        <w:t>Depurar prepara el recorrido. Paso avanza una instrucción. Entrar y Salir sirven cuando hay una función o un procedimiento. Continuar sigue hasta una pausa. Pausar detiene el recorrido. Detener lo termina. Reiniciar vuelve al inicio. El punto marca la línea. El panel muestra la pila y las variables.</w:t>
       </w:r>
     </w:p>
     <w:p>
@@ -1954,8 +1374,8 @@
       <w:r>
         <w:drawing>
           <wp:inline xmlns:a="http://schemas.openxmlformats.org/drawingml/2006/main" xmlns:pic="http://schemas.openxmlformats.org/drawingml/2006/picture">
-            <wp:extent cx="5852160" cy="3657600"/>
-            <wp:docPr id="15" name="Picture 15"/>
+            <wp:extent cx="5852160" cy="4403799"/>
+            <wp:docPr id="13" name="Picture 13"/>
             <wp:cNvGraphicFramePr>
               <a:graphicFrameLocks noChangeAspect="1"/>
             </wp:cNvGraphicFramePr>
@@ -1963,11 +1383,11 @@
               <a:graphicData uri="http://schemas.openxmlformats.org/drawingml/2006/picture">
                 <pic:pic>
                   <pic:nvPicPr>
-                    <pic:cNvPr id="0" name="14-clasificar.png"/>
+                    <pic:cNvPr id="0" name="10-depurar.png"/>
                     <pic:cNvPicPr/>
                   </pic:nvPicPr>
                   <pic:blipFill>
-                    <a:blip r:embed="rId23"/>
+                    <a:blip r:embed="rId21"/>
                     <a:stretch>
                       <a:fillRect/>
                     </a:stretch>
@@ -1975,7 +1395,7 @@
                   <pic:spPr>
                     <a:xfrm>
                       <a:off x="0" y="0"/>
-                      <a:ext cx="5852160" cy="3657600"/>
+                      <a:ext cx="5852160" cy="4403799"/>
                     </a:xfrm>
                     <a:prstGeom prst="rect"/>
                   </pic:spPr>
@@ -1998,155 +1418,20 @@
           <w:color w:val="475569"/>
           <w:sz w:val="20"/>
         </w:rPr>
-        <w:t>Figura 15. Momento Razonar de un reto Clasificar.</w:t>
+        <w:t>Figura 13. Depuración de Hola mundo, parada en Escribir.</w:t>
       </w:r>
     </w:p>
     <w:p>
-      <w:pPr>
-        <w:pStyle w:val="Heading2"/>
-      </w:pPr>
-      <w:r>
-        <w:rPr>
-          <w:rFonts w:ascii="Calibri" w:hAnsi="Calibri" w:cs="Calibri"/>
-          <w:b/>
-          <w:i w:val="0"/>
-          <w:color w:val="3D2A5C"/>
-          <w:sz w:val="32"/>
-        </w:rPr>
-        <w:t>Clasificar</w:t>
-      </w:r>
-    </w:p>
-    <w:p>
+      <w:pPr/>
       <w:r>
         <w:rPr>
           <w:rFonts w:ascii="Calibri" w:hAnsi="Calibri" w:cs="Calibri"/>
           <w:b w:val="0"/>
           <w:i w:val="0"/>
+          <w:color w:val="1E293B"/>
           <w:sz w:val="24"/>
         </w:rPr>
-        <w:t>Cada frase se marca con una clase. En el ejemplo de la figura 15 las clases son entrada, proceso, salida y restricción. Eliges una por frase y compruebas.</w:t>
-      </w:r>
-    </w:p>
-    <w:p>
-      <w:r>
-        <w:rPr>
-          <w:rFonts w:ascii="Calibri" w:hAnsi="Calibri" w:cs="Calibri"/>
-          <w:b w:val="0"/>
-          <w:i w:val="0"/>
-          <w:sz w:val="24"/>
-        </w:rPr>
-        <w:t>Ejemplo. «El precio que escribe la persona» es entrada. «El total que se muestra» es salida. «El precio no puede ser negativo» es restricción.</w:t>
-      </w:r>
-    </w:p>
-    <w:p>
-      <w:pPr>
-        <w:pStyle w:val="Heading2"/>
-      </w:pPr>
-      <w:r>
-        <w:rPr>
-          <w:rFonts w:ascii="Calibri" w:hAnsi="Calibri" w:cs="Calibri"/>
-          <w:b/>
-          <w:i w:val="0"/>
-          <w:color w:val="3D2A5C"/>
-          <w:sz w:val="32"/>
-        </w:rPr>
-        <w:t>Ordenar</w:t>
-      </w:r>
-    </w:p>
-    <w:p>
-      <w:r>
-        <w:rPr>
-          <w:rFonts w:ascii="Calibri" w:hAnsi="Calibri" w:cs="Calibri"/>
-          <w:b w:val="0"/>
-          <w:i w:val="0"/>
-          <w:sz w:val="24"/>
-        </w:rPr>
-        <w:t>Las instrucciones aparecen desordenadas. Las pones en el orden en que el algoritmo debe ejecutarlas.</w:t>
-      </w:r>
-    </w:p>
-    <w:p>
-      <w:r>
-        <w:rPr>
-          <w:rFonts w:ascii="Calibri" w:hAnsi="Calibri" w:cs="Calibri"/>
-          <w:b w:val="0"/>
-          <w:i w:val="0"/>
-          <w:sz w:val="24"/>
-        </w:rPr>
-        <w:t>Ejemplo. Para preguntar el nombre, el orden es: escribir la pregunta, leer el nombre y después escribir el saludo. Si lees antes de preguntar, la persona no sabe qué dato se espera.</w:t>
-      </w:r>
-    </w:p>
-    <w:p>
-      <w:pPr>
-        <w:pStyle w:val="Heading2"/>
-      </w:pPr>
-      <w:r>
-        <w:rPr>
-          <w:rFonts w:ascii="Calibri" w:hAnsi="Calibri" w:cs="Calibri"/>
-          <w:b/>
-          <w:i w:val="0"/>
-          <w:color w:val="3D2A5C"/>
-          <w:sz w:val="32"/>
-        </w:rPr>
-        <w:t>Construir</w:t>
-      </w:r>
-    </w:p>
-    <w:p>
-      <w:r>
-        <w:rPr>
-          <w:rFonts w:ascii="Calibri" w:hAnsi="Calibri" w:cs="Calibri"/>
-          <w:b w:val="0"/>
-          <w:i w:val="0"/>
-          <w:sz w:val="24"/>
-        </w:rPr>
-        <w:t>Escribes el pseudocódigo, o lo armas con bloques, y lo pruebas con los casos del reto. Cada caso trae entradas y la salida esperada. El reto compara tu salida con esa.</w:t>
-      </w:r>
-    </w:p>
-    <w:p>
-      <w:r>
-        <w:rPr>
-          <w:rFonts w:ascii="Calibri" w:hAnsi="Calibri" w:cs="Calibri"/>
-          <w:b w:val="0"/>
-          <w:i w:val="0"/>
-          <w:sz w:val="24"/>
-        </w:rPr>
-        <w:t>Ejemplo. El reto pide el doble de un entero. Lees n, calculas n * 2 y lo escribes. Si el caso de ejemplo entra 4, tu salida tiene que ser 8.</w:t>
-      </w:r>
-    </w:p>
-    <w:p>
-      <w:pPr>
-        <w:pStyle w:val="Heading2"/>
-      </w:pPr>
-      <w:r>
-        <w:rPr>
-          <w:rFonts w:ascii="Calibri" w:hAnsi="Calibri" w:cs="Calibri"/>
-          <w:b/>
-          <w:i w:val="0"/>
-          <w:color w:val="3D2A5C"/>
-          <w:sz w:val="32"/>
-        </w:rPr>
-        <w:t>Predecir</w:t>
-      </w:r>
-    </w:p>
-    <w:p>
-      <w:r>
-        <w:rPr>
-          <w:rFonts w:ascii="Calibri" w:hAnsi="Calibri" w:cs="Calibri"/>
-          <w:b w:val="0"/>
-          <w:i w:val="0"/>
-          <w:sz w:val="24"/>
-        </w:rPr>
-        <w:t>Lees un algoritmo ya escrito y dices qué va a salir, antes de ejecutarlo. Después puedes correrlo para comprobar.</w:t>
-      </w:r>
-    </w:p>
-    <w:p>
-      <w:r>
-        <w:rPr>
-          <w:rFonts w:ascii="Calibri" w:hAnsi="Calibri" w:cs="Calibri"/>
-          <w:b w:val="0"/>
-          <w:i w:val="0"/>
-          <w:sz w:val="24"/>
-        </w:rPr>
-        <w:t>Ejemplo. El algoritmo hace n &lt;- 2 y luego Escribir n + 1. La predicción es 3. Si escribes 2, fallaste la suma, aunque el algoritmo esté bien.</w:t>
+        <w:t>Ejemplo. Depurar Hola mundo y pulsar Paso deja la marca en Escribir. La pila dice HolaMundo y todavía no hay variables, porque ese algoritmo no define ninguna.</w:t>
       </w:r>
     </w:p>
     <w:p>
@@ -2161,29 +1446,20 @@
           <w:color w:val="3D2A5C"/>
           <w:sz w:val="44"/>
         </w:rPr>
-        <w:t>18. Práctica libre</w:t>
+        <w:t>13. Laboratorio: las rutas</w:t>
       </w:r>
     </w:p>
     <w:p>
+      <w:pPr/>
       <w:r>
         <w:rPr>
           <w:rFonts w:ascii="Calibri" w:hAnsi="Calibri" w:cs="Calibri"/>
           <w:b w:val="0"/>
           <w:i w:val="0"/>
+          <w:color w:val="1E293B"/>
           <w:sz w:val="24"/>
         </w:rPr>
-        <w:t>Práctica libre no es un reto y no suma puntos. A la izquierda están los grupos de bloques: Variables, Entrada y salida, Operadores, Decisiones, Ciclos, Arreglos y Funciones. Arrastras un bloque al lienzo. El pseudocódigo de la derecha se escribe solo a partir del lienzo. Abajo ves la salida y las variables.</w:t>
-      </w:r>
-    </w:p>
-    <w:p>
-      <w:r>
-        <w:rPr>
-          <w:rFonts w:ascii="Calibri" w:hAnsi="Calibri" w:cs="Calibri"/>
-          <w:b w:val="0"/>
-          <w:i w:val="0"/>
-          <w:sz w:val="24"/>
-        </w:rPr>
-        <w:t>La barra del lienzo tiene Ejecutar, Pausar, Continuar, Un paso, Detener y Reiniciar. Ctrl+Enter ejecuta, Ctrl+. da un paso y Esc detiene. Puedes ponerle nombre y Guardar. Nueva deja el lienzo en blanco. Abrir archivo carga un texto. Las prácticas guardadas aparecen en la lista de abajo.</w:t>
+        <w:t>Laboratorio cambia el banco de trabajo por las rutas y la práctica libre. Actualizar vuelve a pedir los datos. Volver al editor regresa al banco de trabajo.</w:t>
       </w:r>
     </w:p>
     <w:p>
@@ -2193,8 +1469,8 @@
       <w:r>
         <w:drawing>
           <wp:inline xmlns:a="http://schemas.openxmlformats.org/drawingml/2006/main" xmlns:pic="http://schemas.openxmlformats.org/drawingml/2006/picture">
-            <wp:extent cx="5852160" cy="3657600"/>
-            <wp:docPr id="16" name="Picture 16"/>
+            <wp:extent cx="5852160" cy="4403799"/>
+            <wp:docPr id="14" name="Picture 14"/>
             <wp:cNvGraphicFramePr>
               <a:graphicFrameLocks noChangeAspect="1"/>
             </wp:cNvGraphicFramePr>
@@ -2202,11 +1478,11 @@
               <a:graphicData uri="http://schemas.openxmlformats.org/drawingml/2006/picture">
                 <pic:pic>
                   <pic:nvPicPr>
-                    <pic:cNvPr id="0" name="15-practica.png"/>
+                    <pic:cNvPr id="0" name="11-rutas.png"/>
                     <pic:cNvPicPr/>
                   </pic:nvPicPr>
                   <pic:blipFill>
-                    <a:blip r:embed="rId24"/>
+                    <a:blip r:embed="rId22"/>
                     <a:stretch>
                       <a:fillRect/>
                     </a:stretch>
@@ -2214,7 +1490,7 @@
                   <pic:spPr>
                     <a:xfrm>
                       <a:off x="0" y="0"/>
-                      <a:ext cx="5852160" cy="3657600"/>
+                      <a:ext cx="5852160" cy="4403799"/>
                     </a:xfrm>
                     <a:prstGeom prst="rect"/>
                   </pic:spPr>
@@ -2237,55 +1513,20 @@
           <w:color w:val="475569"/>
           <w:sz w:val="20"/>
         </w:rPr>
-        <w:t>Figura 16. Práctica libre, con el lienzo vacío y la caja de bloques.</w:t>
+        <w:t>Figura 14. Rutas del alumno: Fundamentos, De básico a avanzado y Práctica de concurso.</w:t>
       </w:r>
     </w:p>
     <w:p>
+      <w:pPr/>
       <w:r>
         <w:rPr>
           <w:rFonts w:ascii="Calibri" w:hAnsi="Calibri" w:cs="Calibri"/>
           <w:b w:val="0"/>
           <w:i w:val="0"/>
+          <w:color w:val="1E293B"/>
           <w:sz w:val="24"/>
         </w:rPr>
-        <w:t>Ejemplo. Abres Entrada y salida, arrastras un Escribir con el texto Hola y pulsas Ejecutar. La salida muestra Hola y el panel de pseudocódigo muestra el Escribir correspondiente. Le pones de nombre Saludo y pulsas Guardar. La próxima vez lo abres desde Prácticas guardadas.</w:t>
-      </w:r>
-    </w:p>
-    <w:p>
-      <w:pPr>
-        <w:pStyle w:val="Heading1"/>
-      </w:pPr>
-      <w:r>
-        <w:rPr>
-          <w:rFonts w:ascii="Calibri" w:hAnsi="Calibri" w:cs="Calibri"/>
-          <w:b/>
-          <w:i w:val="0"/>
-          <w:color w:val="3D2A5C"/>
-          <w:sz w:val="44"/>
-        </w:rPr>
-        <w:t>19. Armar diagrama</w:t>
-      </w:r>
-    </w:p>
-    <w:p>
-      <w:r>
-        <w:rPr>
-          <w:rFonts w:ascii="Calibri" w:hAnsi="Calibri" w:cs="Calibri"/>
-          <w:b w:val="0"/>
-          <w:i w:val="0"/>
-          <w:sz w:val="24"/>
-        </w:rPr>
-        <w:t>Armar diagrama construye el algoritmo desde las figuras, al revés del panel Diagrama. A la izquierda eliges la figura. La arrastras a un hueco del flujo, o haces doble clic para añadirla al final. Para mover una figura ya puesta, la seleccionas y haces clic en otro hueco, o la arrastras. En una decisión, la rama V sale a la derecha y la F a la izquierda. Función y procedimiento quedan fuera del algoritmo principal.</w:t>
-      </w:r>
-    </w:p>
-    <w:p>
-      <w:r>
-        <w:rPr>
-          <w:rFonts w:ascii="Calibri" w:hAnsi="Calibri" w:cs="Calibri"/>
-          <w:b w:val="0"/>
-          <w:i w:val="0"/>
-          <w:sz w:val="24"/>
-        </w:rPr>
-        <w:t>Arriba puedes cambiar el nombre. Cargar ejemplo trae un algoritmo de muestra. Vaciar borra el lienzo. Pasar al editor abre el texto en tus proyectos. Copiar y Descargar se llevan el pseudocódigo. El texto de la derecha sigue a las figuras: si editas una figura, el texto cambia.</w:t>
+        <w:t>Cada tarjeta dice cuántos retos hay y cuántos están hechos. Una ruta de un docente solo aparece si está publicada y asignada a esa cuenta o a su comunidad.</w:t>
       </w:r>
     </w:p>
     <w:p>
@@ -2295,8 +1536,8 @@
       <w:r>
         <w:drawing>
           <wp:inline xmlns:a="http://schemas.openxmlformats.org/drawingml/2006/main" xmlns:pic="http://schemas.openxmlformats.org/drawingml/2006/picture">
-            <wp:extent cx="5852160" cy="3657600"/>
-            <wp:docPr id="17" name="Picture 17"/>
+            <wp:extent cx="5852160" cy="4403799"/>
+            <wp:docPr id="15" name="Picture 15"/>
             <wp:cNvGraphicFramePr>
               <a:graphicFrameLocks noChangeAspect="1"/>
             </wp:cNvGraphicFramePr>
@@ -2304,11 +1545,11 @@
               <a:graphicData uri="http://schemas.openxmlformats.org/drawingml/2006/picture">
                 <pic:pic>
                   <pic:nvPicPr>
-                    <pic:cNvPr id="0" name="16-armar.png"/>
+                    <pic:cNvPr id="0" name="12-ruta-fundamentos.png"/>
                     <pic:cNvPicPr/>
                   </pic:nvPicPr>
                   <pic:blipFill>
-                    <a:blip r:embed="rId25"/>
+                    <a:blip r:embed="rId23"/>
                     <a:stretch>
                       <a:fillRect/>
                     </a:stretch>
@@ -2316,7 +1557,7 @@
                   <pic:spPr>
                     <a:xfrm>
                       <a:off x="0" y="0"/>
-                      <a:ext cx="5852160" cy="3657600"/>
+                      <a:ext cx="5852160" cy="4403799"/>
                     </a:xfrm>
                     <a:prstGeom prst="rect"/>
                   </pic:spPr>
@@ -2339,18 +1580,20 @@
           <w:color w:val="475569"/>
           <w:sz w:val="20"/>
         </w:rPr>
-        <w:t>Figura 17. Armar diagrama con el ejemplo Adivina_Numero.</w:t>
+        <w:t>Figura 15. Fundamentos abre el primer reto y deja los siguientes bloqueados.</w:t>
       </w:r>
     </w:p>
     <w:p>
+      <w:pPr/>
       <w:r>
         <w:rPr>
           <w:rFonts w:ascii="Calibri" w:hAnsi="Calibri" w:cs="Calibri"/>
           <w:b w:val="0"/>
           <w:i w:val="0"/>
+          <w:color w:val="1E293B"/>
           <w:sz w:val="24"/>
         </w:rPr>
-        <w:t>Ejemplo. Pulsas Cargar ejemplo. El nombre pasa a Adivina_Numero. El diagrama define los intentos y el número secreto, escribe la pregunta, lee el intento y entra en un Mientras. Si pasas ese diagrama al editor, puedes ejecutarlo: el secreto es un entero entre 0 y 100, y cada intento dice si vas bajo o alto.</w:t>
+        <w:t>Ejemplo. Fundamentos tiene 34 retos. El primero, Qué entra y qué sale, está abierto. El segundo sigue bloqueado hasta terminar el primero. La barra marca 0 de 34.</w:t>
       </w:r>
     </w:p>
     <w:p>
@@ -2365,51 +1608,113 @@
           <w:color w:val="3D2A5C"/>
           <w:sz w:val="44"/>
         </w:rPr>
-        <w:t>20. Qué cambia con el nivel</w:t>
+        <w:t>14. Un reto</w:t>
       </w:r>
     </w:p>
     <w:p>
+      <w:pPr/>
       <w:r>
         <w:rPr>
           <w:rFonts w:ascii="Calibri" w:hAnsi="Calibri" w:cs="Calibri"/>
           <w:b w:val="0"/>
           <w:i w:val="0"/>
+          <w:color w:val="1E293B"/>
           <w:sz w:val="24"/>
         </w:rPr>
-        <w:t>Los botones de este manual no están todos en todas las cuentas. El nivel Gratis de estudiante incluye el editor, validar, ejecutar, pegar, el laboratorio, la ruta y la práctica libre. Permite 2 proyectos y 5 algoritmos, sin contar Ejemplos. No incluye el diagrama, armar diagrama, traducir, depurar ni descargar.</w:t>
+        <w:t>Abrir entra al reto. El tiempo corre arriba. Las etapas son comprender, razonar, construir o comprobar, y explicar. La ayuda ofrece pistas. La última pista es la solución explicada.</w:t>
       </w:r>
     </w:p>
     <w:p>
+      <w:pPr>
+        <w:jc w:val="center"/>
+      </w:pPr>
+      <w:r>
+        <w:drawing>
+          <wp:inline xmlns:a="http://schemas.openxmlformats.org/drawingml/2006/main" xmlns:pic="http://schemas.openxmlformats.org/drawingml/2006/picture">
+            <wp:extent cx="5852160" cy="4403799"/>
+            <wp:docPr id="16" name="Picture 16"/>
+            <wp:cNvGraphicFramePr>
+              <a:graphicFrameLocks noChangeAspect="1"/>
+            </wp:cNvGraphicFramePr>
+            <a:graphic>
+              <a:graphicData uri="http://schemas.openxmlformats.org/drawingml/2006/picture">
+                <pic:pic>
+                  <pic:nvPicPr>
+                    <pic:cNvPr id="0" name="13-reto.png"/>
+                    <pic:cNvPicPr/>
+                  </pic:nvPicPr>
+                  <pic:blipFill>
+                    <a:blip r:embed="rId24"/>
+                    <a:stretch>
+                      <a:fillRect/>
+                    </a:stretch>
+                  </pic:blipFill>
+                  <pic:spPr>
+                    <a:xfrm>
+                      <a:off x="0" y="0"/>
+                      <a:ext cx="5852160" cy="4403799"/>
+                    </a:xfrm>
+                    <a:prstGeom prst="rect"/>
+                  </pic:spPr>
+                </pic:pic>
+              </a:graphicData>
+            </a:graphic>
+          </wp:inline>
+        </w:drawing>
+      </w:r>
+    </w:p>
+    <w:p>
+      <w:pPr>
+        <w:jc w:val="center"/>
+      </w:pPr>
+      <w:r>
+        <w:rPr>
+          <w:rFonts w:ascii="Calibri" w:hAnsi="Calibri" w:cs="Calibri"/>
+          <w:b w:val="0"/>
+          <w:i/>
+          <w:color w:val="475569"/>
+          <w:sz w:val="20"/>
+        </w:rPr>
+        <w:t>Figura 16. Qué entra y qué sale, en la etapa Comprender.</w:t>
+      </w:r>
+    </w:p>
+    <w:p>
+      <w:pPr/>
       <w:r>
         <w:rPr>
           <w:rFonts w:ascii="Calibri" w:hAnsi="Calibri" w:cs="Calibri"/>
           <w:b w:val="0"/>
           <w:i w:val="0"/>
+          <w:color w:val="1E293B"/>
           <w:sz w:val="24"/>
         </w:rPr>
-        <w:t>El nivel Premium de estudiante enciende esas acciones y quita el tope de proyectos y algoritmos. Si el nivel tiene fecha y se vence, las acciones vuelven a las del nivel por defecto, aunque la cuenta siga mostrando el nombre del nivel vencido.</w:t>
+        <w:t>En comprender se lee el enunciado y se confirma Ya lo comprendo. En un reto de clasificar se elige la clase de cada frase. En uno de ordenar se acomodan los pasos. En uno de predecir se escribe antes la salida y solo después se puede ejecutar. En uno de construir se arma el programa con código, con el diagrama o con bloques.</w:t>
       </w:r>
     </w:p>
     <w:p>
+      <w:pPr/>
       <w:r>
         <w:rPr>
           <w:rFonts w:ascii="Calibri" w:hAnsi="Calibri" w:cs="Calibri"/>
           <w:b w:val="0"/>
           <w:i w:val="0"/>
+          <w:color w:val="1E293B"/>
           <w:sz w:val="24"/>
         </w:rPr>
-        <w:t>Un docente puede, además, apagar traducir o pegar para tu grupo o solo para ti. Eso no enciende una acción que tu nivel ya tenga apagada. Si traducir está apagado, el botón no genera código. Si pegar está apagado, sigues pudiendo escribir.</w:t>
+        <w:t>Un reto de construir no se cierra si falta un caso. La salida tiene que coincidir en todos. Al terminar, la pantalla muestra la respuesta: el pseudocódigo y, si se armó con bloques o con el diagrama, esa misma forma. La explicación pide al menos doce caracteres.</w:t>
       </w:r>
     </w:p>
     <w:p>
+      <w:pPr/>
       <w:r>
         <w:rPr>
           <w:rFonts w:ascii="Calibri" w:hAnsi="Calibri" w:cs="Calibri"/>
           <w:b w:val="0"/>
           <w:i w:val="0"/>
+          <w:color w:val="1E293B"/>
           <w:sz w:val="24"/>
         </w:rPr>
-        <w:t>Ejemplo. Con Gratis abres el editor y ejecutas Hola mundo, y no ves Traducir ni Depurar. Cuando quien administra la cuenta te asigna Premium, Actualizar hace aparecer Traducir, Depurar, el diagrama y Armar diagrama.</w:t>
+        <w:t>Ejemplo. Qué entra y qué sale pide clasificar cada frase como entrada, proceso, salida o restricción. Ana lee el enunciado de la caja que cobra un producto y pulsa Ya lo comprendo para pasar a razonar.</w:t>
       </w:r>
     </w:p>
     <w:p>
@@ -2424,132 +1729,20 @@
           <w:color w:val="3D2A5C"/>
           <w:sz w:val="44"/>
         </w:rPr>
-        <w:t>21. Operadores</w:t>
+        <w:t>15. Práctica libre</w:t>
       </w:r>
     </w:p>
     <w:p>
-      <w:pPr>
-        <w:spacing w:after="160"/>
-      </w:pPr>
+      <w:pPr/>
       <w:r>
         <w:rPr>
           <w:rFonts w:ascii="Calibri" w:hAnsi="Calibri" w:cs="Calibri"/>
           <w:b w:val="0"/>
           <w:i w:val="0"/>
-          <w:color w:val="1E1B2E"/>
+          <w:color w:val="1E293B"/>
           <w:sz w:val="24"/>
         </w:rPr>
-        <w:t>Operadores, en la barra, abre el panel Operadores que puedes usar. Sirve para consultar un símbolo sin salir del algoritmo. Cerrar el panel, o pulsar Escape, vuelve al editor. El texto del algoritmo no cambia.</w:t>
-      </w:r>
-    </w:p>
-    <w:p>
-      <w:pPr>
-        <w:spacing w:after="160"/>
-      </w:pPr>
-      <w:r>
-        <w:rPr>
-          <w:rFonts w:ascii="Calibri" w:hAnsi="Calibri" w:cs="Calibri"/>
-          <w:b w:val="0"/>
-          <w:i w:val="0"/>
-          <w:color w:val="1E1B2E"/>
-          <w:sz w:val="24"/>
-        </w:rPr>
-        <w:t>Arriba está el orden de una expresión: ^ liga más fuerte, luego * / DIV MOD, luego + y -, luego las comparaciones, y al final NO, Y y O. &lt;- asigna y no va dentro de una expresión. Debajo, los símbolos quedan en cinco grupos.</w:t>
-      </w:r>
-    </w:p>
-    <w:p>
-      <w:pPr>
-        <w:pStyle w:val="ListBullet"/>
-        <w:spacing w:after="40"/>
-      </w:pPr>
-      <w:r>
-        <w:rPr>
-          <w:rFonts w:ascii="Calibri" w:hAnsi="Calibri" w:cs="Calibri"/>
-          <w:b w:val="0"/>
-          <w:i w:val="0"/>
-          <w:color w:val="1E1B2E"/>
-          <w:sz w:val="24"/>
-        </w:rPr>
-        <w:t>Asignación: &lt;- copia el valor de la derecha en la variable de la izquierda.</w:t>
-      </w:r>
-    </w:p>
-    <w:p>
-      <w:pPr>
-        <w:pStyle w:val="ListBullet"/>
-        <w:spacing w:after="40"/>
-      </w:pPr>
-      <w:r>
-        <w:rPr>
-          <w:rFonts w:ascii="Calibri" w:hAnsi="Calibri" w:cs="Calibri"/>
-          <w:b w:val="0"/>
-          <w:i w:val="0"/>
-          <w:color w:val="1E1B2E"/>
-          <w:sz w:val="24"/>
-        </w:rPr>
-        <w:t>Aritméticos: + suma, - resta, * multiplica, / divide y el resultado es real, ^ es la potencia, DIV es la división entera, MOD es el residuo y % equivale a MOD.</w:t>
-      </w:r>
-    </w:p>
-    <w:p>
-      <w:pPr>
-        <w:pStyle w:val="ListBullet"/>
-        <w:spacing w:after="40"/>
-      </w:pPr>
-      <w:r>
-        <w:rPr>
-          <w:rFonts w:ascii="Calibri" w:hAnsi="Calibri" w:cs="Calibri"/>
-          <w:b w:val="0"/>
-          <w:i w:val="0"/>
-          <w:color w:val="1E1B2E"/>
-          <w:sz w:val="24"/>
-        </w:rPr>
-        <w:t>Comparación: = pregunta si dos valores son iguales y no asigna. &lt;&gt; y != preguntan si son distintos. &lt;, &lt;=, &gt; y &gt;= comparan el orden.</w:t>
-      </w:r>
-    </w:p>
-    <w:p>
-      <w:pPr>
-        <w:pStyle w:val="ListBullet"/>
-        <w:spacing w:after="40"/>
-      </w:pPr>
-      <w:r>
-        <w:rPr>
-          <w:rFonts w:ascii="Calibri" w:hAnsi="Calibri" w:cs="Calibri"/>
-          <w:b w:val="0"/>
-          <w:i w:val="0"/>
-          <w:color w:val="1E1B2E"/>
-          <w:sz w:val="24"/>
-        </w:rPr>
-        <w:t>Lógicos: NO niega un valor. Y pide que las dos condiciones se cumplan. O basta con que una se cumpla.</w:t>
-      </w:r>
-    </w:p>
-    <w:p>
-      <w:pPr>
-        <w:pStyle w:val="ListBullet"/>
-        <w:spacing w:after="40"/>
-      </w:pPr>
-      <w:r>
-        <w:rPr>
-          <w:rFonts w:ascii="Calibri" w:hAnsi="Calibri" w:cs="Calibri"/>
-          <w:b w:val="0"/>
-          <w:i w:val="0"/>
-          <w:color w:val="1E1B2E"/>
-          <w:sz w:val="24"/>
-        </w:rPr>
-        <w:t>Agrupación: los paréntesis cambian ese orden.</w:t>
-      </w:r>
-    </w:p>
-    <w:p>
-      <w:pPr>
-        <w:spacing w:after="160"/>
-      </w:pPr>
-      <w:r>
-        <w:rPr>
-          <w:rFonts w:ascii="Calibri" w:hAnsi="Calibri" w:cs="Calibri"/>
-          <w:b w:val="0"/>
-          <w:i w:val="0"/>
-          <w:color w:val="1E1B2E"/>
-          <w:sz w:val="24"/>
-        </w:rPr>
-        <w:t>Ejemplo. En Área de un triángulo la cuenta es (base * altura) / 2. Ana abre Operadores y comprueba que * liga antes que /. Los paréntesis hacen la multiplicación primero y / deja un real. 2 ^ 3 ^ 2 se lee 2 ^ (3 ^ 2). Con el idioma en inglés, el mismo panel escribe Div, Mod, Not, And y Or.</w:t>
+        <w:t>Práctica libre es un editor para probar sin guardar el algoritmo en un proyecto. Ejecutar, Pausar, Continuar, Un paso, Detener y Reiniciar usan el mismo intérprete. Ctrl+Enter ejecuta, Ctrl+. da un paso y Esc detiene. Lo que se escribe aquí no aparece en el banco de trabajo.</w:t>
       </w:r>
     </w:p>
     <w:p>
@@ -2559,8 +1752,8 @@
       <w:r>
         <w:drawing>
           <wp:inline xmlns:a="http://schemas.openxmlformats.org/drawingml/2006/main" xmlns:pic="http://schemas.openxmlformats.org/drawingml/2006/picture">
-            <wp:extent cx="5852160" cy="3657600"/>
-            <wp:docPr id="18" name="Picture 18"/>
+            <wp:extent cx="5852160" cy="4403799"/>
+            <wp:docPr id="17" name="Picture 17"/>
             <wp:cNvGraphicFramePr>
               <a:graphicFrameLocks noChangeAspect="1"/>
             </wp:cNvGraphicFramePr>
@@ -2568,11 +1761,11 @@
               <a:graphicData uri="http://schemas.openxmlformats.org/drawingml/2006/picture">
                 <pic:pic>
                   <pic:nvPicPr>
-                    <pic:cNvPr id="0" name="18-operadores.png"/>
+                    <pic:cNvPr id="0" name="15-practica.png"/>
                     <pic:cNvPicPr/>
                   </pic:nvPicPr>
                   <pic:blipFill>
-                    <a:blip r:embed="rId26"/>
+                    <a:blip r:embed="rId25"/>
                     <a:stretch>
                       <a:fillRect/>
                     </a:stretch>
@@ -2580,7 +1773,7 @@
                   <pic:spPr>
                     <a:xfrm>
                       <a:off x="0" y="0"/>
-                      <a:ext cx="5852160" cy="3657600"/>
+                      <a:ext cx="5852160" cy="4403799"/>
                     </a:xfrm>
                     <a:prstGeom prst="rect"/>
                   </pic:spPr>
@@ -2593,7 +1786,6 @@
     </w:p>
     <w:p>
       <w:pPr>
-        <w:spacing w:after="240"/>
         <w:jc w:val="center"/>
       </w:pPr>
       <w:r>
@@ -2604,7 +1796,20 @@
           <w:color w:val="475569"/>
           <w:sz w:val="20"/>
         </w:rPr>
-        <w:t>Figura 18. Panel Operadores abierto sobre el algoritmo Área de un triángulo.</w:t>
+        <w:t>Figura 17. Práctica libre, con la consola y las variables a la derecha.</w:t>
+      </w:r>
+    </w:p>
+    <w:p>
+      <w:pPr/>
+      <w:r>
+        <w:rPr>
+          <w:rFonts w:ascii="Calibri" w:hAnsi="Calibri" w:cs="Calibri"/>
+          <w:b w:val="0"/>
+          <w:i w:val="0"/>
+          <w:color w:val="1E293B"/>
+          <w:sz w:val="24"/>
+        </w:rPr>
+        <w:t>Ejemplo. Se puede escribir un Escribir suelto, ejecutarlo y ver la salida, y volver al editor sin crear un algoritmo nuevo.</w:t>
       </w:r>
     </w:p>
     <w:p>
@@ -2619,37 +1824,20 @@
           <w:color w:val="3D2A5C"/>
           <w:sz w:val="44"/>
         </w:rPr>
-        <w:t>22. Manuales</w:t>
+        <w:t>16. Armar diagrama</w:t>
       </w:r>
     </w:p>
     <w:p>
-      <w:pPr>
-        <w:spacing w:after="160"/>
-      </w:pPr>
+      <w:pPr/>
       <w:r>
         <w:rPr>
           <w:rFonts w:ascii="Calibri" w:hAnsi="Calibri" w:cs="Calibri"/>
           <w:b w:val="0"/>
           <w:i w:val="0"/>
-          <w:color w:val="1E1B2E"/>
+          <w:color w:val="1E293B"/>
           <w:sz w:val="24"/>
         </w:rPr>
-        <w:t>Manuales abre dos documentos: Manual del lenguaje y Manual del alumno. Ver abre el PDF en una ventana de la aplicación. Descargar PDF lo guarda. En el navegador usa la descarga del navegador. En la aplicación de escritorio abre el diálogo de guardar del sistema; si se cancela, no queda archivo. Si no se puede escribir, el aviso dice que no se pudo guardar el archivo.</w:t>
-      </w:r>
-    </w:p>
-    <w:p>
-      <w:pPr>
-        <w:spacing w:after="160"/>
-      </w:pPr>
-      <w:r>
-        <w:rPr>
-          <w:rFonts w:ascii="Calibri" w:hAnsi="Calibri" w:cs="Calibri"/>
-          <w:b w:val="0"/>
-          <w:i w:val="0"/>
-          <w:color w:val="1E1B2E"/>
-          <w:sz w:val="24"/>
-        </w:rPr>
-        <w:t>Ejemplo. Ana pulsa Manuales y luego Ver en Manual del lenguaje. La ventana se titula Manual del lenguaje y muestra el PDF. Descargar PDF guarda Manual-del-lenguaje.pdf. El manual del docente no aparece en una cuenta de alumno.</w:t>
+        <w:t>Armar diagrama construye el algoritmo con figuras. El panel Figura queda arriba de la caja de figuras. Ahí se escribe el texto de la figura elegida: los valores de Escribir, los destinos de Leer y los segundos de Esperar. Debajo están las figuras. A la derecha, el pseudocódigo sigue al diagrama.</w:t>
       </w:r>
     </w:p>
     <w:p>
@@ -2659,8 +1847,8 @@
       <w:r>
         <w:drawing>
           <wp:inline xmlns:a="http://schemas.openxmlformats.org/drawingml/2006/main" xmlns:pic="http://schemas.openxmlformats.org/drawingml/2006/picture">
-            <wp:extent cx="5852160" cy="3657600"/>
-            <wp:docPr id="19" name="Picture 19"/>
+            <wp:extent cx="5852160" cy="4403799"/>
+            <wp:docPr id="18" name="Picture 18"/>
             <wp:cNvGraphicFramePr>
               <a:graphicFrameLocks noChangeAspect="1"/>
             </wp:cNvGraphicFramePr>
@@ -2668,11 +1856,11 @@
               <a:graphicData uri="http://schemas.openxmlformats.org/drawingml/2006/picture">
                 <pic:pic>
                   <pic:nvPicPr>
-                    <pic:cNvPr id="0" name="19-manuales.png"/>
+                    <pic:cNvPr id="0" name="16-armar.png"/>
                     <pic:cNvPicPr/>
                   </pic:nvPicPr>
                   <pic:blipFill>
-                    <a:blip r:embed="rId27"/>
+                    <a:blip r:embed="rId26"/>
                     <a:stretch>
                       <a:fillRect/>
                     </a:stretch>
@@ -2680,7 +1868,7 @@
                   <pic:spPr>
                     <a:xfrm>
                       <a:off x="0" y="0"/>
-                      <a:ext cx="5852160" cy="3657600"/>
+                      <a:ext cx="5852160" cy="4403799"/>
                     </a:xfrm>
                     <a:prstGeom prst="rect"/>
                   </pic:spPr>
@@ -2693,7 +1881,6 @@
     </w:p>
     <w:p>
       <w:pPr>
-        <w:spacing w:after="240"/>
         <w:jc w:val="center"/>
       </w:pPr>
       <w:r>
@@ -2704,7 +1891,33 @@
           <w:color w:val="475569"/>
           <w:sz w:val="20"/>
         </w:rPr>
-        <w:t>Figura 19. Manuales de una cuenta de alumno: lenguaje y alumno, cada uno con Ver y Descargar PDF.</w:t>
+        <w:t>Figura 18. Armar diagrama. El panel de la figura está arriba de las figuras.</w:t>
+      </w:r>
+    </w:p>
+    <w:p>
+      <w:pPr/>
+      <w:r>
+        <w:rPr>
+          <w:rFonts w:ascii="Calibri" w:hAnsi="Calibri" w:cs="Calibri"/>
+          <w:b w:val="0"/>
+          <w:i w:val="0"/>
+          <w:color w:val="1E293B"/>
+          <w:sz w:val="24"/>
+        </w:rPr>
+        <w:t>Arrastra una figura al diagrama o haz doble clic para añadirla al final. La rama V de una decisión sale a la derecha y la F, a la izquierda. Volver al editor regresa al banco de trabajo. Enviar al editor copia el texto a un algoritmo.</w:t>
+      </w:r>
+    </w:p>
+    <w:p>
+      <w:pPr/>
+      <w:r>
+        <w:rPr>
+          <w:rFonts w:ascii="Calibri" w:hAnsi="Calibri" w:cs="Calibri"/>
+          <w:b w:val="0"/>
+          <w:i w:val="0"/>
+          <w:color w:val="1E293B"/>
+          <w:sz w:val="24"/>
+        </w:rPr>
+        <w:t>Ejemplo. Para el saludo se elige la figura Escribir. En el panel de arriba, en Valores, se escribe "Hola mundo". El pseudocódigo de la derecha queda con Escribir "Hola mundo".</w:t>
       </w:r>
     </w:p>
     <w:p>
@@ -2719,52 +1932,20 @@
           <w:color w:val="3D2A5C"/>
           <w:sz w:val="44"/>
         </w:rPr>
-        <w:t>23. Una sola sesión</w:t>
+        <w:t>17. Una sola sesión y el bloqueo</w:t>
       </w:r>
     </w:p>
     <w:p>
-      <w:pPr>
-        <w:spacing w:after="160"/>
-      </w:pPr>
+      <w:pPr/>
       <w:r>
         <w:rPr>
           <w:rFonts w:ascii="Calibri" w:hAnsi="Calibri" w:cs="Calibri"/>
           <w:b w:val="0"/>
           <w:i w:val="0"/>
-          <w:color w:val="1E1B2E"/>
+          <w:color w:val="1E293B"/>
           <w:sz w:val="24"/>
         </w:rPr>
-        <w:t>La cuenta solo puede estar abierta en un equipo. Entrar en otro, o en la aplicación mientras el navegador sigue dentro, no abre una segunda sesión. Salir en el primero la libera. Si nadie la cierra, a los 30 minutos sin uso también queda libre y la pantalla que estaba abierta pide volver a entrar: la sesión se cerró por inactividad.</w:t>
-      </w:r>
-    </w:p>
-    <w:p>
-      <w:pPr>
-        <w:spacing w:after="160"/>
-      </w:pPr>
-      <w:r>
-        <w:rPr>
-          <w:rFonts w:ascii="Calibri" w:hAnsi="Calibri" w:cs="Calibri"/>
-          <w:b w:val="0"/>
-          <w:i w:val="0"/>
-          <w:color w:val="1E1B2E"/>
-          <w:sz w:val="24"/>
-        </w:rPr>
-        <w:t>Tres veces seguidas con el correo o la contraseña que no coinciden bloquean ese correo durante 15 minutos. Las dos primeras avisan que el correo o la contraseña son incorrectos. La tercera dice que hay que esperar. El bloqueo es del correo, aunque la contraseña buena se escriba después.</w:t>
-      </w:r>
-    </w:p>
-    <w:p>
-      <w:pPr>
-        <w:spacing w:after="160"/>
-      </w:pPr>
-      <w:r>
-        <w:rPr>
-          <w:rFonts w:ascii="Calibri" w:hAnsi="Calibri" w:cs="Calibri"/>
-          <w:b w:val="0"/>
-          <w:i w:val="0"/>
-          <w:color w:val="1E1B2E"/>
-          <w:sz w:val="24"/>
-        </w:rPr>
-        <w:t>Ejemplo. Alguien escribe tres veces una contraseña que no es la de la cuenta. La pantalla queda así:</w:t>
+        <w:t>Una cuenta solo tiene una sesión. Otro navegador, otra máquina o la aplicación de escritorio, si la cuenta ya está abierta, reciben que la sesión está en otro equipo. Hay que cerrarla ahí o esperar 30 minutos sin usarla. Dos pestañas del mismo navegador comparten la sesión.</w:t>
       </w:r>
     </w:p>
     <w:p>
@@ -2774,7 +1955,74 @@
       <w:r>
         <w:drawing>
           <wp:inline xmlns:a="http://schemas.openxmlformats.org/drawingml/2006/main" xmlns:pic="http://schemas.openxmlformats.org/drawingml/2006/picture">
-            <wp:extent cx="5852160" cy="3657600"/>
+            <wp:extent cx="5852160" cy="4403799"/>
+            <wp:docPr id="19" name="Picture 19"/>
+            <wp:cNvGraphicFramePr>
+              <a:graphicFrameLocks noChangeAspect="1"/>
+            </wp:cNvGraphicFramePr>
+            <a:graphic>
+              <a:graphicData uri="http://schemas.openxmlformats.org/drawingml/2006/picture">
+                <pic:pic>
+                  <pic:nvPicPr>
+                    <pic:cNvPr id="0" name="21-sesion.png"/>
+                    <pic:cNvPicPr/>
+                  </pic:nvPicPr>
+                  <pic:blipFill>
+                    <a:blip r:embed="rId27"/>
+                    <a:stretch>
+                      <a:fillRect/>
+                    </a:stretch>
+                  </pic:blipFill>
+                  <pic:spPr>
+                    <a:xfrm>
+                      <a:off x="0" y="0"/>
+                      <a:ext cx="5852160" cy="4403799"/>
+                    </a:xfrm>
+                    <a:prstGeom prst="rect"/>
+                  </pic:spPr>
+                </pic:pic>
+              </a:graphicData>
+            </a:graphic>
+          </wp:inline>
+        </w:drawing>
+      </w:r>
+    </w:p>
+    <w:p>
+      <w:pPr>
+        <w:jc w:val="center"/>
+      </w:pPr>
+      <w:r>
+        <w:rPr>
+          <w:rFonts w:ascii="Calibri" w:hAnsi="Calibri" w:cs="Calibri"/>
+          <w:b w:val="0"/>
+          <w:i/>
+          <w:color w:val="475569"/>
+          <w:sz w:val="20"/>
+        </w:rPr>
+        <w:t>Figura 19. La cuenta ya está abierta en otro equipo.</w:t>
+      </w:r>
+    </w:p>
+    <w:p>
+      <w:pPr/>
+      <w:r>
+        <w:rPr>
+          <w:rFonts w:ascii="Calibri" w:hAnsi="Calibri" w:cs="Calibri"/>
+          <w:b w:val="0"/>
+          <w:i w:val="0"/>
+          <w:color w:val="1E293B"/>
+          <w:sz w:val="24"/>
+        </w:rPr>
+        <w:t>Tres ingresos fallidos del mismo correo lo bloquean 15 minutos. El mensaje aparece aunque la contraseña siguiente sea la correcta. Salir cierra la sesión de este equipo.</w:t>
+      </w:r>
+    </w:p>
+    <w:p>
+      <w:pPr>
+        <w:jc w:val="center"/>
+      </w:pPr>
+      <w:r>
+        <w:drawing>
+          <wp:inline xmlns:a="http://schemas.openxmlformats.org/drawingml/2006/main" xmlns:pic="http://schemas.openxmlformats.org/drawingml/2006/picture">
+            <wp:extent cx="5852160" cy="4403799"/>
             <wp:docPr id="20" name="Picture 20"/>
             <wp:cNvGraphicFramePr>
               <a:graphicFrameLocks noChangeAspect="1"/>
@@ -2795,7 +2043,7 @@
                   <pic:spPr>
                     <a:xfrm>
                       <a:off x="0" y="0"/>
-                      <a:ext cx="5852160" cy="3657600"/>
+                      <a:ext cx="5852160" cy="4403799"/>
                     </a:xfrm>
                     <a:prstGeom prst="rect"/>
                   </pic:spPr>
@@ -2808,7 +2056,6 @@
     </w:p>
     <w:p>
       <w:pPr>
-        <w:spacing w:after="240"/>
         <w:jc w:val="center"/>
       </w:pPr>
       <w:r>
@@ -2819,147 +2066,20 @@
           <w:color w:val="475569"/>
           <w:sz w:val="20"/>
         </w:rPr>
-        <w:t>Figura 20. Al tercer intento fallido, el correo queda bloqueado 15 minutos.</w:t>
+        <w:t>Figura 20. Tras tres intentos, hay que esperar 15 minutos.</w:t>
       </w:r>
     </w:p>
     <w:p>
-      <w:pPr>
-        <w:spacing w:after="160"/>
-      </w:pPr>
+      <w:pPr/>
       <w:r>
         <w:rPr>
           <w:rFonts w:ascii="Calibri" w:hAnsi="Calibri" w:cs="Calibri"/>
           <w:b w:val="0"/>
           <w:i w:val="0"/>
-          <w:color w:val="1E1B2E"/>
+          <w:color w:val="1E293B"/>
           <w:sz w:val="24"/>
         </w:rPr>
-        <w:t>Ejemplo. La cuenta ya entró en un equipo. En otro, con el correo y la contraseña correctos, Aulivana-FCDdesign no abre el editor. Hay que salir en el primero o esperar 30 minutos sin usarla.</w:t>
-      </w:r>
-    </w:p>
-    <w:p>
-      <w:pPr>
-        <w:jc w:val="center"/>
-      </w:pPr>
-      <w:r>
-        <w:drawing>
-          <wp:inline xmlns:a="http://schemas.openxmlformats.org/drawingml/2006/main" xmlns:pic="http://schemas.openxmlformats.org/drawingml/2006/picture">
-            <wp:extent cx="5852160" cy="3657600"/>
-            <wp:docPr id="21" name="Picture 21"/>
-            <wp:cNvGraphicFramePr>
-              <a:graphicFrameLocks noChangeAspect="1"/>
-            </wp:cNvGraphicFramePr>
-            <a:graphic>
-              <a:graphicData uri="http://schemas.openxmlformats.org/drawingml/2006/picture">
-                <pic:pic>
-                  <pic:nvPicPr>
-                    <pic:cNvPr id="0" name="21-sesion.png"/>
-                    <pic:cNvPicPr/>
-                  </pic:nvPicPr>
-                  <pic:blipFill>
-                    <a:blip r:embed="rId29"/>
-                    <a:stretch>
-                      <a:fillRect/>
-                    </a:stretch>
-                  </pic:blipFill>
-                  <pic:spPr>
-                    <a:xfrm>
-                      <a:off x="0" y="0"/>
-                      <a:ext cx="5852160" cy="3657600"/>
-                    </a:xfrm>
-                    <a:prstGeom prst="rect"/>
-                  </pic:spPr>
-                </pic:pic>
-              </a:graphicData>
-            </a:graphic>
-          </wp:inline>
-        </w:drawing>
-      </w:r>
-    </w:p>
-    <w:p>
-      <w:pPr>
-        <w:spacing w:after="240"/>
-        <w:jc w:val="center"/>
-      </w:pPr>
-      <w:r>
-        <w:rPr>
-          <w:rFonts w:ascii="Calibri" w:hAnsi="Calibri" w:cs="Calibri"/>
-          <w:b w:val="0"/>
-          <w:i/>
-          <w:color w:val="475569"/>
-          <w:sz w:val="20"/>
-        </w:rPr>
-        <w:t>Figura 21. La segunda entrada avisa que ya hay una sesión abierta.</w:t>
-      </w:r>
-    </w:p>
-    <w:p>
-      <w:pPr>
-        <w:spacing w:after="160"/>
-      </w:pPr>
-      <w:r>
-        <w:rPr>
-          <w:rFonts w:ascii="Calibri" w:hAnsi="Calibri" w:cs="Calibri"/>
-          <w:b w:val="0"/>
-          <w:i w:val="0"/>
-          <w:color w:val="1E1B2E"/>
-          <w:sz w:val="24"/>
-        </w:rPr>
-        <w:t>Ver, en Manuales, abre el PDF dentro de la ventana. Cerrar o Escape vuelve al editor. Descargar PDF guarda ese mismo archivo.</w:t>
-      </w:r>
-    </w:p>
-    <w:p>
-      <w:pPr>
-        <w:jc w:val="center"/>
-      </w:pPr>
-      <w:r>
-        <w:drawing>
-          <wp:inline xmlns:a="http://schemas.openxmlformats.org/drawingml/2006/main" xmlns:pic="http://schemas.openxmlformats.org/drawingml/2006/picture">
-            <wp:extent cx="5852160" cy="3657600"/>
-            <wp:docPr id="22" name="Picture 22"/>
-            <wp:cNvGraphicFramePr>
-              <a:graphicFrameLocks noChangeAspect="1"/>
-            </wp:cNvGraphicFramePr>
-            <a:graphic>
-              <a:graphicData uri="http://schemas.openxmlformats.org/drawingml/2006/picture">
-                <pic:pic>
-                  <pic:nvPicPr>
-                    <pic:cNvPr id="0" name="22-ver-pdf.png"/>
-                    <pic:cNvPicPr/>
-                  </pic:nvPicPr>
-                  <pic:blipFill>
-                    <a:blip r:embed="rId30"/>
-                    <a:stretch>
-                      <a:fillRect/>
-                    </a:stretch>
-                  </pic:blipFill>
-                  <pic:spPr>
-                    <a:xfrm>
-                      <a:off x="0" y="0"/>
-                      <a:ext cx="5852160" cy="3657600"/>
-                    </a:xfrm>
-                    <a:prstGeom prst="rect"/>
-                  </pic:spPr>
-                </pic:pic>
-              </a:graphicData>
-            </a:graphic>
-          </wp:inline>
-        </w:drawing>
-      </w:r>
-    </w:p>
-    <w:p>
-      <w:pPr>
-        <w:spacing w:after="240"/>
-        <w:jc w:val="center"/>
-      </w:pPr>
-      <w:r>
-        <w:rPr>
-          <w:rFonts w:ascii="Calibri" w:hAnsi="Calibri" w:cs="Calibri"/>
-          <w:b w:val="0"/>
-          <w:i/>
-          <w:color w:val="475569"/>
-          <w:sz w:val="20"/>
-        </w:rPr>
-        <w:t>Figura 22. Ver abre el PDF del manual del lenguaje, con Descargar PDF y Cerrar.</w:t>
+        <w:t>Ejemplo. Ana entra en la computadora del salón. Si intenta entrar en la de su casa sin salir antes, ve el aviso de la sesión abierta. Si alguien escribe mal la contraseña tres veces, el correo queda bloqueado un cuarto de hora.</w:t>
       </w:r>
     </w:p>
     <w:sectPr>

</xml_diff>

<commit_message>
se permite especificar retos sin casos para validar
</commit_message>
<xml_diff>
--- a/docs/manual-alumno/Manual-del-alumno.docx
+++ b/docs/manual-alumno/Manual-del-alumno.docx
@@ -59,7 +59,7 @@
           <w:color w:val="1E293B"/>
           <w:sz w:val="24"/>
         </w:rPr>
-        <w:t>26 de octubre de 2026</w:t>
+        <w:t>27 de octubre de 2026</w:t>
       </w:r>
     </w:p>
     <w:p>
@@ -412,6 +412,15 @@
           <w:sz w:val="24"/>
         </w:rPr>
         <w:t>Arriba están el nombre, los puntos, el puesto, los días del nivel y los menús. A la izquierda, los proyectos y los algoritmos. En el centro, el pseudocódigo. A la derecha, el diagrama del mismo algoritmo.</w:t>
+      </w:r>
+      <w:r>
+        <w:rPr>
+          <w:rFonts w:ascii="Calibri" w:hAnsi="Calibri"/>
+          <w:b w:val="0"/>
+          <w:color w:val="1E293B"/>
+          <w:sz w:val="24"/>
+        </w:rPr>
+        <w:t xml:space="preserve"> Junto a los días aparece cuántas ejecuciones quedan hoy. Si el nivel no tiene tope, ese número es el signo de infinito. Si se acaban, la misma cifra queda en cero y Ejecutar deja de estar disponible.</w:t>
       </w:r>
     </w:p>
     <w:p>
@@ -2230,6 +2239,15 @@
         </w:rPr>
         <w:t xml:space="preserve"> Detener cierra ese programa. Si tarda demasiado, se corta solo, y no corren más de seis a la vez.</w:t>
       </w:r>
+      <w:r>
+        <w:rPr>
+          <w:rFonts w:ascii="Calibri" w:hAnsi="Calibri"/>
+          <w:b w:val="0"/>
+          <w:color w:val="1E293B"/>
+          <w:sz w:val="24"/>
+        </w:rPr>
+        <w:t xml:space="preserve"> La ventana es una pantalla propia, con Volver al editor. Si el servicio de lenguajes del servidor no responde, el aviso es que Lenguajes no está disponible. En el servidor público los compiladores ya están en un contenedor aparte; en la aplicación de escritorio, si faltan, se descargan en la máquina.</w:t>
+      </w:r>
     </w:p>
     <w:p>
       <w:pPr>

</xml_diff>

<commit_message>
se define = y <- como asignacion en pesudo codigo y == para comparar
</commit_message>
<xml_diff>
--- a/docs/manual-alumno/Manual-del-alumno.docx
+++ b/docs/manual-alumno/Manual-del-alumno.docx
@@ -59,7 +59,7 @@
           <w:color w:val="1E293B"/>
           <w:sz w:val="24"/>
         </w:rPr>
-        <w:t>27 de octubre de 2026</w:t>
+        <w:t>28 de octubre de 2026</w:t>
       </w:r>
     </w:p>
     <w:p>
@@ -430,6 +430,15 @@
           <w:sz w:val="24"/>
         </w:rPr>
         <w:t xml:space="preserve"> Junto al nombre, la campana Avisos de retos marca un reto que no estaba o uno que el docente volvió a habilitar. Marcar como vistos los quita. La primera vez que se abre la aplicación solo los recuerda.</w:t>
+      </w:r>
+      <w:r>
+        <w:rPr>
+          <w:rFonts w:ascii="Calibri" w:hAnsi="Calibri"/>
+          <w:b w:val="0"/>
+          <w:color w:val="1E293B"/>
+          <w:sz w:val="24"/>
+        </w:rPr>
+        <w:t xml:space="preserve"> Unirme, en la barra, pide el código de 6 caracteres que dio el docente. Si es válido, la cuenta queda en esa comunidad. Si ya estaba, el aviso lo dice.</w:t>
       </w:r>
     </w:p>
     <w:p>
@@ -1996,6 +2005,15 @@
         </w:rPr>
         <w:t xml:space="preserve"> Armar Nassi-Shneiderman está al lado y usa las mismas figuras con otro dibujo: Si parte el bloque en dos columnas, los ciclos encierran el cuerpo y Según abre una columna por caso. Dimension pide el nombre y el tamaño. El borrador de cada estilo se guarda por separado.</w:t>
       </w:r>
+      <w:r>
+        <w:rPr>
+          <w:rFonts w:ascii="Calibri" w:hAnsi="Calibri"/>
+          <w:b w:val="0"/>
+          <w:color w:val="1E293B"/>
+          <w:sz w:val="24"/>
+        </w:rPr>
+        <w:t xml:space="preserve"> Al elegir una figura de la lista, o al arrastrarla, las demás se separan para dejar el hueco. Al soltar, se vuelven a juntar.</w:t>
+      </w:r>
     </w:p>
     <w:p>
       <w:pPr>

</xml_diff>